<commit_message>
séance du 15 juin 20262
</commit_message>
<xml_diff>
--- a/Enquete/2- LIVRABLE DE LA PHASE D'IDEATION.docx
+++ b/Enquete/2- LIVRABLE DE LA PHASE D'IDEATION.docx
@@ -1,10 +1,10 @@
 
 <file path=word/document.xml><?xml version="1.0" encoding="utf-8"?>
-<w:document xmlns:wpc="http://schemas.microsoft.com/office/word/2010/wordprocessingCanvas" xmlns:cx="http://schemas.microsoft.com/office/drawing/2014/chartex" xmlns:cx1="http://schemas.microsoft.com/office/drawing/2015/9/8/chartex" xmlns:cx2="http://schemas.microsoft.com/office/drawing/2015/10/21/chartex" xmlns:cx3="http://schemas.microsoft.com/office/drawing/2016/5/9/chartex" xmlns:cx4="http://schemas.microsoft.com/office/drawing/2016/5/10/chartex" xmlns:cx5="http://schemas.microsoft.com/office/drawing/2016/5/11/chartex" xmlns:cx6="http://schemas.microsoft.com/office/drawing/2016/5/12/chartex" xmlns:cx7="http://schemas.microsoft.com/office/drawing/2016/5/13/chartex" xmlns:cx8="http://schemas.microsoft.com/office/drawing/2016/5/14/chartex" xmlns:mc="http://schemas.openxmlformats.org/markup-compatibility/2006" xmlns:aink="http://schemas.microsoft.com/office/drawing/2016/ink" xmlns:am3d="http://schemas.microsoft.com/office/drawing/2017/model3d" xmlns:o="urn:schemas-microsoft-com:office:office" xmlns:oel="http://schemas.microsoft.com/office/2019/extlst" xmlns:r="http://schemas.openxmlformats.org/officeDocument/2006/relationships" xmlns:m="http://schemas.openxmlformats.org/officeDocument/2006/math" xmlns:v="urn:schemas-microsoft-com:vml" xmlns:wp14="http://schemas.microsoft.com/office/word/2010/wordprocessingDrawing" xmlns:wp="http://schemas.openxmlformats.org/drawingml/2006/wordprocessingDrawing" xmlns:w10="urn:schemas-microsoft-com:office:word" xmlns:w="http://schemas.openxmlformats.org/wordprocessingml/2006/main" xmlns:w14="http://schemas.microsoft.com/office/word/2010/wordml" xmlns:w15="http://schemas.microsoft.com/office/word/2012/wordml" xmlns:w16cex="http://schemas.microsoft.com/office/word/2018/wordml/cex" xmlns:w16cid="http://schemas.microsoft.com/office/word/2016/wordml/cid" xmlns:w16="http://schemas.microsoft.com/office/word/2018/wordml" xmlns:w16du="http://schemas.microsoft.com/office/word/2023/wordml/word16du" xmlns:w16sdtdh="http://schemas.microsoft.com/office/word/2020/wordml/sdtdatahash" xmlns:w16sdtfl="http://schemas.microsoft.com/office/word/2024/wordml/sdtformatlock" xmlns:w16se="http://schemas.microsoft.com/office/word/2015/wordml/symex" xmlns:wpg="http://schemas.microsoft.com/office/word/2010/wordprocessingGroup" xmlns:wpi="http://schemas.microsoft.com/office/word/2010/wordprocessingInk" xmlns:wne="http://schemas.microsoft.com/office/word/2006/wordml" xmlns:wps="http://schemas.microsoft.com/office/word/2010/wordprocessingShape" mc:Ignorable="w14 w15 w16se w16cid w16 w16cex w16sdtdh w16sdtfl w16du wp14">
+<w:document xmlns:wpc="http://schemas.microsoft.com/office/word/2010/wordprocessingCanvas" xmlns:cx="http://schemas.microsoft.com/office/drawing/2014/chartex" xmlns:cx1="http://schemas.microsoft.com/office/drawing/2015/9/8/chartex" xmlns:mc="http://schemas.openxmlformats.org/markup-compatibility/2006" xmlns:o="urn:schemas-microsoft-com:office:office" xmlns:r="http://schemas.openxmlformats.org/officeDocument/2006/relationships" xmlns:m="http://schemas.openxmlformats.org/officeDocument/2006/math" xmlns:v="urn:schemas-microsoft-com:vml" xmlns:wp14="http://schemas.microsoft.com/office/word/2010/wordprocessingDrawing" xmlns:wp="http://schemas.openxmlformats.org/drawingml/2006/wordprocessingDrawing" xmlns:w10="urn:schemas-microsoft-com:office:word" xmlns:w="http://schemas.openxmlformats.org/wordprocessingml/2006/main" xmlns:w14="http://schemas.microsoft.com/office/word/2010/wordml" xmlns:w15="http://schemas.microsoft.com/office/word/2012/wordml" xmlns:w16se="http://schemas.microsoft.com/office/word/2015/wordml/symex" xmlns:wpg="http://schemas.microsoft.com/office/word/2010/wordprocessingGroup" xmlns:wpi="http://schemas.microsoft.com/office/word/2010/wordprocessingInk" xmlns:wne="http://schemas.microsoft.com/office/word/2006/wordml" xmlns:wps="http://schemas.microsoft.com/office/word/2010/wordprocessingShape" mc:Ignorable="w14 w15 w16se wp14">
   <w:body>
     <w:p>
       <w:pPr>
-        <w:pStyle w:val="Title"/>
+        <w:pStyle w:val="Titre"/>
         <w:jc w:val="center"/>
         <w:rPr>
           <w:lang w:val="fr-SN"/>
@@ -44,7 +44,21 @@
         <w:rPr>
           <w:lang w:val="fr-SN"/>
         </w:rPr>
-        <w:t>Université Alioune Diop de Bambey  ·  Juin 2026</w:t>
+        <w:t xml:space="preserve">Université Alioune Diop de </w:t>
+      </w:r>
+      <w:proofErr w:type="gramStart"/>
+      <w:r>
+        <w:rPr>
+          <w:lang w:val="fr-SN"/>
+        </w:rPr>
+        <w:t>Bambey  ·</w:t>
+      </w:r>
+      <w:proofErr w:type="gramEnd"/>
+      <w:r>
+        <w:rPr>
+          <w:lang w:val="fr-SN"/>
+        </w:rPr>
+        <w:t xml:space="preserve">  Juin 2026</w:t>
       </w:r>
     </w:p>
     <w:p>
@@ -84,7 +98,7 @@
     </w:p>
     <w:p>
       <w:pPr>
-        <w:pStyle w:val="Heading1"/>
+        <w:pStyle w:val="Titre1"/>
         <w:rPr>
           <w:lang w:val="fr-SN"/>
         </w:rPr>
@@ -93,7 +107,13 @@
         <w:rPr>
           <w:lang w:val="fr-SN"/>
         </w:rPr>
-        <w:t>CONTEXTE ET CADRAGE</w:t>
+        <w:t xml:space="preserve">CONTEXTE ET </w:t>
+      </w:r>
+      <w:r>
+        <w:rPr>
+          <w:lang w:val="fr-SN"/>
+        </w:rPr>
+        <w:t>CADRAGE</w:t>
       </w:r>
     </w:p>
     <w:p>
@@ -176,12 +196,18 @@
         <w:rPr>
           <w:lang w:val="fr-SN"/>
         </w:rPr>
-        <w:t>). Son objectif est de générer un maximum d'idées créatives et réalisables pour répondre aux questions HMW prioritaires, puis de les sélectionner pour construire un prototype.</w:t>
+        <w:t>). Son objectif est de génér</w:t>
+      </w:r>
+      <w:r>
+        <w:rPr>
+          <w:lang w:val="fr-SN"/>
+        </w:rPr>
+        <w:t>er un maximum d'idées créatives et réalisables pour répondre aux questions HMW prioritaires, puis de les sélectionner pour construire un prototype.</w:t>
       </w:r>
     </w:p>
     <w:p>
       <w:pPr>
-        <w:pStyle w:val="Heading1"/>
+        <w:pStyle w:val="Titre1"/>
         <w:rPr>
           <w:lang w:val="fr-SN"/>
         </w:rPr>
@@ -203,12 +229,18 @@
         <w:rPr>
           <w:lang w:val="fr-SN"/>
         </w:rPr>
-        <w:t>Toutes les idées générées respectent la contrainte suivante : réalisables dans le cadre d'un projet académique étudiant, sans financement externe, en s'appuyant exclusivement sur :</w:t>
+        <w:t xml:space="preserve">Toutes les idées générées respectent la </w:t>
+      </w:r>
+      <w:r>
+        <w:rPr>
+          <w:lang w:val="fr-SN"/>
+        </w:rPr>
+        <w:t>contrainte suivante : réalisables dans le cadre d'un projet académique étudiant, sans financement externe, en s'appuyant exclusivement sur :</w:t>
       </w:r>
     </w:p>
     <w:p>
       <w:pPr>
-        <w:pStyle w:val="ListBullet"/>
+        <w:pStyle w:val="Listepuces"/>
         <w:rPr>
           <w:lang w:val="fr-SN"/>
         </w:rPr>
@@ -217,12 +249,18 @@
         <w:rPr>
           <w:lang w:val="fr-SN"/>
         </w:rPr>
-        <w:t>Les ressources matérielles déjà présentes à l'UFR SATIC (serveurs, PC, caméras non fonctionnelles, réseau partagé SONATEL/SENUM)</w:t>
+        <w:t>Les ressources matérielles déjà présentes à l'UFR SATIC (serveurs, PC, caméras non fonctionnelles, réseau partagé S</w:t>
+      </w:r>
+      <w:r>
+        <w:rPr>
+          <w:lang w:val="fr-SN"/>
+        </w:rPr>
+        <w:t>ONATEL/SENUM)</w:t>
       </w:r>
     </w:p>
     <w:p>
       <w:pPr>
-        <w:pStyle w:val="ListBullet"/>
+        <w:pStyle w:val="Listepuces"/>
         <w:rPr>
           <w:lang w:val="fr-SN"/>
         </w:rPr>
@@ -292,7 +330,7 @@
     </w:p>
     <w:p>
       <w:pPr>
-        <w:pStyle w:val="ListBullet"/>
+        <w:pStyle w:val="Listepuces"/>
         <w:rPr>
           <w:lang w:val="fr-SN"/>
         </w:rPr>
@@ -306,7 +344,7 @@
     </w:p>
     <w:p>
       <w:pPr>
-        <w:pStyle w:val="ListBullet"/>
+        <w:pStyle w:val="Listepuces"/>
         <w:rPr>
           <w:lang w:val="fr-SN"/>
         </w:rPr>
@@ -315,12 +353,18 @@
         <w:rPr>
           <w:lang w:val="fr-SN"/>
         </w:rPr>
-        <w:t>Le réseau local (LAN) comme infrastructure principale, sans dépendance à internet</w:t>
+        <w:t>Le réseau local (LAN) comme infrastructure pr</w:t>
+      </w:r>
+      <w:r>
+        <w:rPr>
+          <w:lang w:val="fr-SN"/>
+        </w:rPr>
+        <w:t>incipale, sans dépendance à internet</w:t>
       </w:r>
     </w:p>
     <w:p>
       <w:pPr>
-        <w:pStyle w:val="ListBullet"/>
+        <w:pStyle w:val="Listepuces"/>
         <w:rPr>
           <w:lang w:val="fr-SN"/>
         </w:rPr>
@@ -341,7 +385,7 @@
     </w:p>
     <w:p>
       <w:pPr>
-        <w:pStyle w:val="Heading1"/>
+        <w:pStyle w:val="Titre1"/>
         <w:rPr>
           <w:lang w:val="fr-SN"/>
         </w:rPr>
@@ -355,7 +399,7 @@
     </w:p>
     <w:tbl>
       <w:tblPr>
-        <w:tblStyle w:val="TableGrid"/>
+        <w:tblStyle w:val="Grilledutableau"/>
         <w:tblW w:w="0" w:type="auto"/>
         <w:tblLook w:val="04A0" w:firstRow="1" w:lastRow="0" w:firstColumn="1" w:lastColumn="0" w:noHBand="0" w:noVBand="1"/>
       </w:tblPr>
@@ -442,7 +486,13 @@
               <w:rPr>
                 <w:lang w:val="fr-SN"/>
               </w:rPr>
-              <w:t>Comment pourrions-nous étendre la capacité de surveillance sans multiplier le personnel humain ?</w:t>
+              <w:t xml:space="preserve">Comment pourrions-nous </w:t>
+            </w:r>
+            <w:r>
+              <w:rPr>
+                <w:lang w:val="fr-SN"/>
+              </w:rPr>
+              <w:t>étendre la capacité de surveillance sans multiplier le personnel humain ?</w:t>
             </w:r>
           </w:p>
         </w:tc>
@@ -530,7 +580,13 @@
               <w:rPr>
                 <w:lang w:val="fr-SN"/>
               </w:rPr>
-              <w:t>Comment concevoir un système de surveillance fonctionnel même avec une connectivité partielle ou un équipement réhabilité ?</w:t>
+              <w:t>Comment concevoir un système de surveillance fo</w:t>
+            </w:r>
+            <w:r>
+              <w:rPr>
+                <w:lang w:val="fr-SN"/>
+              </w:rPr>
+              <w:t>nctionnel même avec une connectivité partielle ou un équipement réhabilité ?</w:t>
             </w:r>
           </w:p>
         </w:tc>
@@ -610,7 +666,13 @@
               <w:rPr>
                 <w:lang w:val="fr-SN"/>
               </w:rPr>
-              <w:t>Comment garantir un dispositif respectueux de la vie privée, conforme à la loi et consensuel institutionnellement ?</w:t>
+              <w:t xml:space="preserve">Comment garantir un dispositif respectueux de la vie privée, </w:t>
+            </w:r>
+            <w:r>
+              <w:rPr>
+                <w:lang w:val="fr-SN"/>
+              </w:rPr>
+              <w:t>conforme à la loi et consensuel institutionnellement ?</w:t>
             </w:r>
           </w:p>
         </w:tc>
@@ -679,7 +741,7 @@
     </w:p>
     <w:p>
       <w:pPr>
-        <w:pStyle w:val="Heading1"/>
+        <w:pStyle w:val="Titre1"/>
         <w:rPr>
           <w:lang w:val="fr-SN"/>
         </w:rPr>
@@ -701,12 +763,18 @@
         <w:rPr>
           <w:lang w:val="fr-SN"/>
         </w:rPr>
-        <w:t>Pour chaque question HMW, plusieurs idées ont été générées sans jugement, en respectant la contrainte zéro budget. L'objectif : quantité d'abord, sélection ensuite.</w:t>
+        <w:t xml:space="preserve">Pour chaque </w:t>
+      </w:r>
+      <w:r>
+        <w:rPr>
+          <w:lang w:val="fr-SN"/>
+        </w:rPr>
+        <w:t>question HMW, plusieurs idées ont été générées sans jugement, en respectant la contrainte zéro budget. L'objectif : quantité d'abord, sélection ensuite.</w:t>
       </w:r>
     </w:p>
     <w:p>
       <w:pPr>
-        <w:pStyle w:val="Heading2"/>
+        <w:pStyle w:val="Titre2"/>
         <w:rPr>
           <w:lang w:val="fr-SN"/>
         </w:rPr>
@@ -720,15 +788,15 @@
     </w:p>
     <w:tbl>
       <w:tblPr>
-        <w:tblStyle w:val="TableGrid"/>
+        <w:tblStyle w:val="Grilledutableau"/>
         <w:tblW w:w="0" w:type="auto"/>
         <w:tblLook w:val="04A0" w:firstRow="1" w:lastRow="0" w:firstColumn="1" w:lastColumn="0" w:noHBand="0" w:noVBand="1"/>
       </w:tblPr>
       <w:tblGrid>
-        <w:gridCol w:w="2220"/>
-        <w:gridCol w:w="2824"/>
-        <w:gridCol w:w="2328"/>
-        <w:gridCol w:w="2250"/>
+        <w:gridCol w:w="2120"/>
+        <w:gridCol w:w="3020"/>
+        <w:gridCol w:w="2310"/>
+        <w:gridCol w:w="2172"/>
       </w:tblGrid>
       <w:tr>
         <w:tc>
@@ -766,7 +834,13 @@
               <w:rPr>
                 <w:b/>
               </w:rPr>
-              <w:t>Ressources nécessaires</w:t>
+              <w:t>Ressources néces</w:t>
+            </w:r>
+            <w:r>
+              <w:rPr>
+                <w:b/>
+              </w:rPr>
+              <w:t>saires</w:t>
             </w:r>
           </w:p>
         </w:tc>
@@ -841,15 +915,32 @@
             </w:r>
             <w:r>
               <w:rPr>
+                <w:b/>
+                <w:color w:val="FF0000"/>
                 <w:lang w:val="fr-SN"/>
               </w:rPr>
               <w:t>https://docs.frigate.video/</w:t>
             </w:r>
             <w:r>
               <w:rPr>
-                <w:lang w:val="fr-SN"/>
-              </w:rPr>
-              <w:t>) installé sur un serveur existant de l'UFR.</w:t>
+                <w:b/>
+                <w:color w:val="FF0000"/>
+                <w:lang w:val="fr-SN"/>
+              </w:rPr>
+              <w:t>)</w:t>
+            </w:r>
+            <w:r>
+              <w:rPr>
+                <w:color w:val="FF0000"/>
+                <w:lang w:val="fr-SN"/>
+              </w:rPr>
+              <w:t xml:space="preserve"> </w:t>
+            </w:r>
+            <w:r>
+              <w:rPr>
+                <w:lang w:val="fr-SN"/>
+              </w:rPr>
+              <w:t>installé sur un serveur existant de l'UFR.</w:t>
             </w:r>
           </w:p>
         </w:tc>
@@ -867,7 +958,13 @@
               <w:rPr>
                 <w:lang w:val="fr-SN"/>
               </w:rPr>
-              <w:t>Caméras existantes + vieux serveur + logiciel open-source</w:t>
+              <w:t xml:space="preserve">Caméras existantes + vieux serveur + logiciel </w:t>
+            </w:r>
+            <w:r>
+              <w:rPr>
+                <w:lang w:val="fr-SN"/>
+              </w:rPr>
+              <w:t>open-source</w:t>
             </w:r>
           </w:p>
         </w:tc>
@@ -947,8 +1044,38 @@
           </w:tcPr>
           <w:p>
             <w:r>
+              <w:t>1.C</w:t>
+            </w:r>
+          </w:p>
+        </w:tc>
+        <w:tc>
+          <w:tcPr>
+            <w:tcW w:w="2351" w:type="dxa"/>
+          </w:tcPr>
+          <w:p>
+            <w:pPr>
+              <w:rPr>
+                <w:lang w:val="fr-SN"/>
+              </w:rPr>
+            </w:pPr>
+            <w:r>
+              <w:rPr>
+                <w:lang w:val="fr-SN"/>
+              </w:rPr>
+              <w:t xml:space="preserve">Développer un tableau de </w:t>
+            </w:r>
+            <w:r>
+              <w:rPr>
+                <w:lang w:val="fr-SN"/>
+              </w:rPr>
               <w:lastRenderedPageBreak/>
-              <w:t>1.C</w:t>
+              <w:t xml:space="preserve">bord </w:t>
+            </w:r>
+            <w:r>
+              <w:rPr>
+                <w:lang w:val="fr-SN"/>
+              </w:rPr>
+              <w:t>web centralisé permettant à 1 seul superviseur de voir simultanément toutes les salles depuis un poste central.</w:t>
             </w:r>
           </w:p>
         </w:tc>
@@ -966,7 +1093,15 @@
               <w:rPr>
                 <w:lang w:val="fr-SN"/>
               </w:rPr>
-              <w:t>Développer un tableau de bord web centralisé permettant à 1 seul superviseur de voir simultanément toutes les salles depuis un poste central.</w:t>
+              <w:lastRenderedPageBreak/>
+              <w:t xml:space="preserve">Développement </w:t>
+            </w:r>
+            <w:r>
+              <w:rPr>
+                <w:lang w:val="fr-SN"/>
+              </w:rPr>
+              <w:lastRenderedPageBreak/>
+              <w:t>étudiant (HTML/JS/Python) + serveur existant</w:t>
             </w:r>
           </w:p>
         </w:tc>
@@ -975,25 +1110,8 @@
             <w:tcW w:w="2351" w:type="dxa"/>
           </w:tcPr>
           <w:p>
-            <w:pPr>
-              <w:rPr>
-                <w:lang w:val="fr-SN"/>
-              </w:rPr>
-            </w:pPr>
-            <w:r>
-              <w:rPr>
-                <w:lang w:val="fr-SN"/>
-              </w:rPr>
-              <w:t>Développement étudiant (HTML/JS/Python) + serveur existant</w:t>
-            </w:r>
-          </w:p>
-        </w:tc>
-        <w:tc>
-          <w:tcPr>
-            <w:tcW w:w="2351" w:type="dxa"/>
-          </w:tcPr>
-          <w:p>
-            <w:r>
+            <w:r>
+              <w:lastRenderedPageBreak/>
               <w:t>0 FCFA</w:t>
             </w:r>
           </w:p>
@@ -1024,7 +1142,13 @@
               <w:rPr>
                 <w:lang w:val="fr-SN"/>
               </w:rPr>
-              <w:t>Repositionner stratégiquement les surveillants humains dans les zones non couvertes par les caméras — optimisation de l'organisation sans coût.</w:t>
+              <w:t>Repositionner stratégiquement les surveillants humains dans les zones non</w:t>
+            </w:r>
+            <w:r>
+              <w:rPr>
+                <w:lang w:val="fr-SN"/>
+              </w:rPr>
+              <w:t xml:space="preserve"> couvertes par les caméras — optimisation de l'organisation sans coût.</w:t>
             </w:r>
           </w:p>
         </w:tc>
@@ -1039,7 +1163,15 @@
             </w:r>
             <w:proofErr w:type="spellEnd"/>
             <w:r>
-              <w:t xml:space="preserve"> humaine </w:t>
+              <w:t xml:space="preserve"> </w:t>
+            </w:r>
+            <w:proofErr w:type="spellStart"/>
+            <w:r>
+              <w:t>humaine</w:t>
+            </w:r>
+            <w:proofErr w:type="spellEnd"/>
+            <w:r>
+              <w:t xml:space="preserve"> </w:t>
             </w:r>
             <w:proofErr w:type="spellStart"/>
             <w:r>
@@ -1084,7 +1216,13 @@
               <w:rPr>
                 <w:lang w:val="fr-SN"/>
               </w:rPr>
-              <w:t>Instaurer un système de délégués intégrité parmi les étudiants — pairs désignés par tirage au sort comme observateurs officiels dans chaque rangée.</w:t>
+              <w:t>Instaurer un système de délégués intégrité parmi les étudiants — pairs désignés par tirage au sort comme observateurs officiels dans chaque r</w:t>
+            </w:r>
+            <w:r>
+              <w:rPr>
+                <w:lang w:val="fr-SN"/>
+              </w:rPr>
+              <w:t>angée.</w:t>
             </w:r>
           </w:p>
         </w:tc>
@@ -1099,7 +1237,15 @@
             </w:r>
             <w:proofErr w:type="spellEnd"/>
             <w:r>
-              <w:t xml:space="preserve"> humaine </w:t>
+              <w:t xml:space="preserve"> </w:t>
+            </w:r>
+            <w:proofErr w:type="spellStart"/>
+            <w:r>
+              <w:t>humaine</w:t>
+            </w:r>
+            <w:proofErr w:type="spellEnd"/>
+            <w:r>
+              <w:t xml:space="preserve"> </w:t>
             </w:r>
             <w:proofErr w:type="spellStart"/>
             <w:r>
@@ -1123,7 +1269,7 @@
     <w:p/>
     <w:p>
       <w:pPr>
-        <w:pStyle w:val="Heading2"/>
+        <w:pStyle w:val="Titre2"/>
         <w:rPr>
           <w:lang w:val="fr-SN"/>
         </w:rPr>
@@ -1137,7 +1283,7 @@
     </w:p>
     <w:tbl>
       <w:tblPr>
-        <w:tblStyle w:val="TableGrid"/>
+        <w:tblStyle w:val="Grilledutableau"/>
         <w:tblW w:w="0" w:type="auto"/>
         <w:tblLook w:val="04A0" w:firstRow="1" w:lastRow="0" w:firstColumn="1" w:lastColumn="0" w:noHBand="0" w:noVBand="1"/>
       </w:tblPr>
@@ -1226,7 +1372,13 @@
               <w:rPr>
                 <w:lang w:val="fr-SN"/>
               </w:rPr>
-              <w:t>Enregistrement vidéo local horodaté (format MP4) sur disque dur ou serveur existant — consultable a posteriori par l'administration.</w:t>
+              <w:t>Enregistrement vidéo local horodaté (format MP4) sur disque dur ou ser</w:t>
+            </w:r>
+            <w:r>
+              <w:rPr>
+                <w:lang w:val="fr-SN"/>
+              </w:rPr>
+              <w:t>veur existant — consultable a posteriori par l'administration.</w:t>
             </w:r>
           </w:p>
         </w:tc>
@@ -1284,7 +1436,13 @@
               <w:rPr>
                 <w:lang w:val="fr-SN"/>
               </w:rPr>
-              <w:t>Application web légère développée par les étudiants pour saisir les incidents en temps réel : heure, salle, type d'incident, description, photo.</w:t>
+              <w:t xml:space="preserve">Application web légère développée par les étudiants pour saisir les incidents en temps réel : heure, salle, type d'incident, </w:t>
+            </w:r>
+            <w:r>
+              <w:rPr>
+                <w:lang w:val="fr-SN"/>
+              </w:rPr>
+              <w:t>description, photo.</w:t>
             </w:r>
           </w:p>
         </w:tc>
@@ -1410,8 +1568,32 @@
           </w:tcPr>
           <w:p>
             <w:r>
+              <w:t>2.D</w:t>
+            </w:r>
+          </w:p>
+        </w:tc>
+        <w:tc>
+          <w:tcPr>
+            <w:tcW w:w="2351" w:type="dxa"/>
+          </w:tcPr>
+          <w:p>
+            <w:pPr>
+              <w:rPr>
+                <w:lang w:val="fr-SN"/>
+              </w:rPr>
+            </w:pPr>
+            <w:r>
+              <w:rPr>
+                <w:lang w:val="fr-SN"/>
+              </w:rPr>
+              <w:t xml:space="preserve">Photo panoramique horodatée de chaque rangée d'étudiants au </w:t>
+            </w:r>
+            <w:r>
+              <w:rPr>
+                <w:lang w:val="fr-SN"/>
+              </w:rPr>
               <w:lastRenderedPageBreak/>
-              <w:t>2.D</w:t>
+              <w:t>début de l'examen, prise par le surveillant avec son smartphone comme preuve de présence.</w:t>
             </w:r>
           </w:p>
         </w:tc>
@@ -1429,25 +1611,14 @@
               <w:rPr>
                 <w:lang w:val="fr-SN"/>
               </w:rPr>
-              <w:t>Photo panoramique horodatée de chaque rangée d'étudiants au début de l'examen, prise par le surveillant avec son smartphone comme preuve de présence.</w:t>
-            </w:r>
-          </w:p>
-        </w:tc>
-        <w:tc>
-          <w:tcPr>
-            <w:tcW w:w="2351" w:type="dxa"/>
-          </w:tcPr>
-          <w:p>
-            <w:pPr>
-              <w:rPr>
-                <w:lang w:val="fr-SN"/>
-              </w:rPr>
-            </w:pPr>
-            <w:r>
-              <w:rPr>
-                <w:lang w:val="fr-SN"/>
-              </w:rPr>
-              <w:t>Smartphone existant du surveillant + stockage serveur local</w:t>
+              <w:lastRenderedPageBreak/>
+              <w:t>Smartphone existant d</w:t>
+            </w:r>
+            <w:r>
+              <w:rPr>
+                <w:lang w:val="fr-SN"/>
+              </w:rPr>
+              <w:t>u surveillant + stockage serveur local</w:t>
             </w:r>
           </w:p>
         </w:tc>
@@ -1524,7 +1695,7 @@
     <w:p/>
     <w:p>
       <w:pPr>
-        <w:pStyle w:val="Heading2"/>
+        <w:pStyle w:val="Titre2"/>
         <w:rPr>
           <w:lang w:val="fr-SN"/>
         </w:rPr>
@@ -1533,12 +1704,18 @@
         <w:rPr>
           <w:lang w:val="fr-SN"/>
         </w:rPr>
-        <w:t>HMW 3 — Concevoir un système fonctionnel même avec connectivité partielle ou équipement réhabilité</w:t>
+        <w:t xml:space="preserve">HMW 3 — Concevoir </w:t>
+      </w:r>
+      <w:r>
+        <w:rPr>
+          <w:lang w:val="fr-SN"/>
+        </w:rPr>
+        <w:t>un système fonctionnel même avec connectivité partielle ou équipement réhabilité</w:t>
       </w:r>
     </w:p>
     <w:tbl>
       <w:tblPr>
-        <w:tblStyle w:val="TableGrid"/>
+        <w:tblStyle w:val="Grilledutableau"/>
         <w:tblW w:w="0" w:type="auto"/>
         <w:tblLook w:val="04A0" w:firstRow="1" w:lastRow="0" w:firstColumn="1" w:lastColumn="0" w:noHBand="0" w:noVBand="1"/>
       </w:tblPr>
@@ -1655,7 +1832,13 @@
               <w:rPr>
                 <w:lang w:val="fr-SN"/>
               </w:rPr>
-              <w:t>) installé sur un PC ou serveur existant, sans aucune dépendance internet.</w:t>
+              <w:t>) installé sur un PC ou serveur existant, sans aucune dépendance interne</w:t>
+            </w:r>
+            <w:r>
+              <w:rPr>
+                <w:lang w:val="fr-SN"/>
+              </w:rPr>
+              <w:t>t.</w:t>
             </w:r>
           </w:p>
         </w:tc>
@@ -1771,7 +1954,13 @@
               <w:rPr>
                 <w:lang w:val="fr-SN"/>
               </w:rPr>
-              <w:t>Synchronisation différée — les données vidéo et incidents s'accumulent localement et se synchronisent automatiquement dès que le réseau est disponible.</w:t>
+              <w:t>S</w:t>
+            </w:r>
+            <w:r>
+              <w:rPr>
+                <w:lang w:val="fr-SN"/>
+              </w:rPr>
+              <w:t>ynchronisation différée — les données vidéo et incidents s'accumulent localement et se synchronisent automatiquement dès que le réseau est disponible.</w:t>
             </w:r>
           </w:p>
         </w:tc>
@@ -1843,14 +2032,20 @@
               <w:rPr>
                 <w:lang w:val="fr-SN"/>
               </w:rPr>
-              <w:t xml:space="preserve">Protocole de basculement automatique — si le réseau tombe, les </w:t>
+              <w:t>Protocole de basculement automatique</w:t>
+            </w:r>
+            <w:r>
+              <w:rPr>
+                <w:lang w:val="fr-SN"/>
+              </w:rPr>
+              <w:t xml:space="preserve"> — si le réseau tombe, les caméras IP réhabilitées enregistrent sur leur </w:t>
             </w:r>
             <w:r>
               <w:rPr>
                 <w:lang w:val="fr-SN"/>
               </w:rPr>
               <w:lastRenderedPageBreak/>
-              <w:t>caméras IP réhabilitées enregistrent sur leur propre carte SD embarquée.</w:t>
+              <w:t>propre carte SD embarquée.</w:t>
             </w:r>
           </w:p>
         </w:tc>
@@ -1923,7 +2118,13 @@
               <w:rPr>
                 <w:lang w:val="fr-SN"/>
               </w:rPr>
-              <w:t>Réhabilitation progressive des caméras hors service par le service informatique appuyé par les étudiants — diagnostic, nettoyage, remplacement de petits composants.</w:t>
+              <w:t xml:space="preserve">Réhabilitation progressive des caméras hors service par le service informatique appuyé par les </w:t>
+            </w:r>
+            <w:r>
+              <w:rPr>
+                <w:lang w:val="fr-SN"/>
+              </w:rPr>
+              <w:t>étudiants — diagnostic, nettoyage, remplacement de petits composants.</w:t>
             </w:r>
           </w:p>
         </w:tc>
@@ -1968,7 +2169,7 @@
     <w:p/>
     <w:p>
       <w:pPr>
-        <w:pStyle w:val="Heading2"/>
+        <w:pStyle w:val="Titre2"/>
         <w:rPr>
           <w:lang w:val="fr-SN"/>
         </w:rPr>
@@ -1982,7 +2183,7 @@
     </w:p>
     <w:tbl>
       <w:tblPr>
-        <w:tblStyle w:val="TableGrid"/>
+        <w:tblStyle w:val="Grilledutableau"/>
         <w:tblW w:w="0" w:type="auto"/>
         <w:tblLook w:val="04A0" w:firstRow="1" w:lastRow="0" w:firstColumn="1" w:lastColumn="0" w:noHBand="0" w:noVBand="1"/>
       </w:tblPr>
@@ -2080,8 +2281,13 @@
             <w:tcW w:w="2351" w:type="dxa"/>
           </w:tcPr>
           <w:p>
-            <w:r>
-              <w:t xml:space="preserve">Système </w:t>
+            <w:proofErr w:type="spellStart"/>
+            <w:r>
+              <w:t>Système</w:t>
+            </w:r>
+            <w:proofErr w:type="spellEnd"/>
+            <w:r>
+              <w:t xml:space="preserve"> </w:t>
             </w:r>
             <w:proofErr w:type="spellStart"/>
             <w:r>
@@ -2134,7 +2340,13 @@
               <w:rPr>
                 <w:lang w:val="fr-SN"/>
               </w:rPr>
-              <w:t>Mobiliser des étudiants en Master (M1/M2) comme superviseurs techniques bénévoles — valorisé comme stage via une convention officielle.</w:t>
+              <w:t xml:space="preserve">Mobiliser des étudiants en Master (M1/M2) comme </w:t>
+            </w:r>
+            <w:r>
+              <w:rPr>
+                <w:lang w:val="fr-SN"/>
+              </w:rPr>
+              <w:t>superviseurs techniques bénévoles — valorisé comme stage via une convention officielle.</w:t>
             </w:r>
           </w:p>
         </w:tc>
@@ -2192,7 +2404,13 @@
               <w:rPr>
                 <w:lang w:val="fr-SN"/>
               </w:rPr>
-              <w:t>Application de gestion des surveillants humains (planning, alertes de retard, confirmation de présence) développée par les étudiants.</w:t>
+              <w:t xml:space="preserve">Application de gestion des surveillants humains (planning, alertes de retard, confirmation de présence) </w:t>
+            </w:r>
+            <w:r>
+              <w:rPr>
+                <w:lang w:val="fr-SN"/>
+              </w:rPr>
+              <w:t>développée par les étudiants.</w:t>
             </w:r>
           </w:p>
         </w:tc>
@@ -2201,11 +2419,16 @@
             <w:tcW w:w="2351" w:type="dxa"/>
           </w:tcPr>
           <w:p>
-            <w:r>
-              <w:t xml:space="preserve">Développement </w:t>
-            </w:r>
             <w:proofErr w:type="spellStart"/>
             <w:r>
+              <w:t>Développement</w:t>
+            </w:r>
+            <w:proofErr w:type="spellEnd"/>
+            <w:r>
+              <w:t xml:space="preserve"> </w:t>
+            </w:r>
+            <w:proofErr w:type="spellStart"/>
+            <w:r>
               <w:t>étudiant</w:t>
             </w:r>
             <w:proofErr w:type="spellEnd"/>
@@ -2218,8 +2441,13 @@
             </w:r>
             <w:proofErr w:type="spellEnd"/>
             <w:r>
-              <w:t xml:space="preserve"> existant</w:t>
-            </w:r>
+              <w:t xml:space="preserve"> </w:t>
+            </w:r>
+            <w:proofErr w:type="spellStart"/>
+            <w:r>
+              <w:t>existant</w:t>
+            </w:r>
+            <w:proofErr w:type="spellEnd"/>
           </w:p>
         </w:tc>
         <w:tc>
@@ -2272,14 +2500,7 @@
               <w:rPr>
                 <w:lang w:val="fr-SN"/>
               </w:rPr>
-              <w:t xml:space="preserve"> de l'université — partage des coûts d'exploitation et des </w:t>
-            </w:r>
-            <w:r>
-              <w:rPr>
-                <w:lang w:val="fr-SN"/>
-              </w:rPr>
-              <w:lastRenderedPageBreak/>
-              <w:t>futurs investissements.</w:t>
+              <w:t xml:space="preserve"> de l'université — partage des coûts d'exploitation et des futurs investissements.</w:t>
             </w:r>
           </w:p>
         </w:tc>
@@ -2297,8 +2518,13 @@
               <w:rPr>
                 <w:lang w:val="fr-SN"/>
               </w:rPr>
-              <w:lastRenderedPageBreak/>
-              <w:t>Accord inter-UFR + infrastructure partagée</w:t>
+              <w:t>Accord inter-UFR + infrastr</w:t>
+            </w:r>
+            <w:r>
+              <w:rPr>
+                <w:lang w:val="fr-SN"/>
+              </w:rPr>
+              <w:t>ucture partagée</w:t>
             </w:r>
           </w:p>
         </w:tc>
@@ -2317,7 +2543,7 @@
     <w:p/>
     <w:p>
       <w:pPr>
-        <w:pStyle w:val="Heading2"/>
+        <w:pStyle w:val="Titre2"/>
         <w:rPr>
           <w:lang w:val="fr-SN"/>
         </w:rPr>
@@ -2326,12 +2552,13 @@
         <w:rPr>
           <w:lang w:val="fr-SN"/>
         </w:rPr>
+        <w:lastRenderedPageBreak/>
         <w:t>HMW 5 — Garantir respect de la vie privée, conformité légale et consensus institutionnel</w:t>
       </w:r>
     </w:p>
     <w:tbl>
       <w:tblPr>
-        <w:tblStyle w:val="TableGrid"/>
+        <w:tblStyle w:val="Grilledutableau"/>
         <w:tblW w:w="0" w:type="auto"/>
         <w:tblLook w:val="04A0" w:firstRow="1" w:lastRow="0" w:firstColumn="1" w:lastColumn="0" w:noHBand="0" w:noVBand="1"/>
       </w:tblPr>
@@ -2420,7 +2647,13 @@
               <w:rPr>
                 <w:lang w:val="fr-SN"/>
               </w:rPr>
-              <w:t>Rédiger une Charte de Vidéosurveillance officielle, signée par le rectorat, le directeur d'UFR et les représentants des étudiants et enseignants.</w:t>
+              <w:t>Rédiger une Charte de Vidéosurveillance officielle, signée par le rectorat, le directeur d'UFR et le</w:t>
+            </w:r>
+            <w:r>
+              <w:rPr>
+                <w:lang w:val="fr-SN"/>
+              </w:rPr>
+              <w:t>s représentants des étudiants et enseignants.</w:t>
             </w:r>
           </w:p>
         </w:tc>
@@ -2478,7 +2711,13 @@
               <w:rPr>
                 <w:lang w:val="fr-SN"/>
               </w:rPr>
-              <w:t>Afficher des panneaux d'information à l'entrée de chaque salle surveillée (conformité légale : mention visible obligatoire) — imprimés sur papier.</w:t>
+              <w:t>Afficher des panneaux d'information à l'entrée de chaque salle surveillée (conformité légale : mention visible obligatoire) — imprimés sur papie</w:t>
+            </w:r>
+            <w:r>
+              <w:rPr>
+                <w:lang w:val="fr-SN"/>
+              </w:rPr>
+              <w:t>r.</w:t>
             </w:r>
           </w:p>
         </w:tc>
@@ -2631,7 +2870,7 @@
     <w:p/>
     <w:p>
       <w:pPr>
-        <w:pStyle w:val="Heading2"/>
+        <w:pStyle w:val="Titre2"/>
         <w:rPr>
           <w:lang w:val="fr-SN"/>
         </w:rPr>
@@ -2640,7 +2879,13 @@
         <w:rPr>
           <w:lang w:val="fr-SN"/>
         </w:rPr>
-        <w:t xml:space="preserve">HMW 6 — Mobiliser les ressources internes pour éviter un investissement </w:t>
+        <w:t>HMW 6 — Mobiliser les ressources int</w:t>
+      </w:r>
+      <w:r>
+        <w:rPr>
+          <w:lang w:val="fr-SN"/>
+        </w:rPr>
+        <w:t xml:space="preserve">ernes pour éviter un investissement </w:t>
       </w:r>
       <w:proofErr w:type="spellStart"/>
       <w:r>
@@ -2659,7 +2904,7 @@
     </w:p>
     <w:tbl>
       <w:tblPr>
-        <w:tblStyle w:val="TableGrid"/>
+        <w:tblStyle w:val="Grilledutableau"/>
         <w:tblW w:w="0" w:type="auto"/>
         <w:tblLook w:val="04A0" w:firstRow="1" w:lastRow="0" w:firstColumn="1" w:lastColumn="0" w:noHBand="0" w:noVBand="1"/>
       </w:tblPr>
@@ -2748,14 +2993,14 @@
               <w:rPr>
                 <w:lang w:val="fr-SN"/>
               </w:rPr>
-              <w:t xml:space="preserve">Projet étudiant encadré — inventaire </w:t>
+              <w:t xml:space="preserve">Projet étudiant encadré — inventaire complet et diagnostic de l'infrastructure existante (caméras, serveurs, réseau) </w:t>
             </w:r>
             <w:r>
               <w:rPr>
                 <w:lang w:val="fr-SN"/>
               </w:rPr>
               <w:lastRenderedPageBreak/>
-              <w:t>complet et diagnostic de l'infrastructure existante (caméras, serveurs, réseau) comme livrable académique de semestre.</w:t>
+              <w:t>comme livrable académique de semestre.</w:t>
             </w:r>
           </w:p>
         </w:tc>
@@ -2767,7 +3012,10 @@
             <w:proofErr w:type="spellStart"/>
             <w:r>
               <w:lastRenderedPageBreak/>
-              <w:t>Compétences</w:t>
+              <w:t>Compétenc</w:t>
+            </w:r>
+            <w:r>
+              <w:t>es</w:t>
             </w:r>
             <w:proofErr w:type="spellEnd"/>
             <w:r>
@@ -2783,7 +3031,6 @@
             </w:r>
             <w:proofErr w:type="spellStart"/>
             <w:r>
-              <w:lastRenderedPageBreak/>
               <w:t>encadrement</w:t>
             </w:r>
             <w:proofErr w:type="spellEnd"/>
@@ -2798,7 +3045,6 @@
           </w:tcPr>
           <w:p>
             <w:r>
-              <w:lastRenderedPageBreak/>
               <w:t>0 FCFA</w:t>
             </w:r>
           </w:p>
@@ -2959,7 +3205,13 @@
               <w:rPr>
                 <w:lang w:val="fr-SN"/>
               </w:rPr>
-              <w:t xml:space="preserve"> (logiciel open-source gratuit).</w:t>
+              <w:t xml:space="preserve"> (logic</w:t>
+            </w:r>
+            <w:r>
+              <w:rPr>
+                <w:lang w:val="fr-SN"/>
+              </w:rPr>
+              <w:t>iel open-source gratuit).</w:t>
             </w:r>
           </w:p>
         </w:tc>
@@ -2996,7 +3248,7 @@
     <w:p/>
     <w:p>
       <w:pPr>
-        <w:pStyle w:val="Heading1"/>
+        <w:pStyle w:val="Titre1"/>
       </w:pPr>
       <w:r>
         <w:t>2. MATRICE DE SÉLECTION DES IDÉES</w:t>
@@ -3004,12 +3256,17 @@
     </w:p>
     <w:p>
       <w:r>
-        <w:t>Critères d'évaluation (note /5) :</w:t>
+        <w:t>Critères d'évaluation (note /5</w:t>
       </w:r>
+      <w:proofErr w:type="gramStart"/>
+      <w:r>
+        <w:t>) :</w:t>
+      </w:r>
+      <w:proofErr w:type="gramEnd"/>
     </w:p>
     <w:p>
       <w:pPr>
-        <w:pStyle w:val="ListBullet"/>
+        <w:pStyle w:val="Listepuces"/>
         <w:rPr>
           <w:lang w:val="fr-SN"/>
         </w:rPr>
@@ -3023,7 +3280,7 @@
     </w:p>
     <w:p>
       <w:pPr>
-        <w:pStyle w:val="ListBullet"/>
+        <w:pStyle w:val="Listepuces"/>
         <w:rPr>
           <w:lang w:val="fr-SN"/>
         </w:rPr>
@@ -3032,12 +3289,18 @@
         <w:rPr>
           <w:lang w:val="fr-SN"/>
         </w:rPr>
-        <w:t>Impact fraude : capacité à réduire ou documenter la fraude</w:t>
+        <w:t>Impact fraude : capacité à réduire ou doc</w:t>
+      </w:r>
+      <w:r>
+        <w:rPr>
+          <w:lang w:val="fr-SN"/>
+        </w:rPr>
+        <w:t>umenter la fraude</w:t>
       </w:r>
     </w:p>
     <w:p>
       <w:pPr>
-        <w:pStyle w:val="ListBullet"/>
+        <w:pStyle w:val="Listepuces"/>
         <w:rPr>
           <w:lang w:val="fr-SN"/>
         </w:rPr>
@@ -3051,7 +3314,7 @@
     </w:p>
     <w:p>
       <w:pPr>
-        <w:pStyle w:val="ListBullet"/>
+        <w:pStyle w:val="Listepuces"/>
         <w:rPr>
           <w:lang w:val="fr-SN"/>
         </w:rPr>
@@ -3072,7 +3335,7 @@
     </w:p>
     <w:tbl>
       <w:tblPr>
-        <w:tblStyle w:val="TableGrid"/>
+        <w:tblStyle w:val="Grilledutableau"/>
         <w:tblW w:w="0" w:type="auto"/>
         <w:tblLook w:val="04A0" w:firstRow="1" w:lastRow="0" w:firstColumn="1" w:lastColumn="0" w:noHBand="0" w:noVBand="1"/>
       </w:tblPr>
@@ -3193,7 +3456,13 @@
               <w:rPr>
                 <w:lang w:val="fr-SN"/>
               </w:rPr>
-              <w:t>1.A — Réhabiliter caméras + NVR open-source</w:t>
+              <w:t xml:space="preserve">1.A — Réhabiliter caméras + </w:t>
+            </w:r>
+            <w:r>
+              <w:rPr>
+                <w:lang w:val="fr-SN"/>
+              </w:rPr>
+              <w:t>NVR open-source</w:t>
             </w:r>
           </w:p>
         </w:tc>
@@ -3353,7 +3622,6 @@
               <w:rPr>
                 <w:lang w:val="fr-SN"/>
               </w:rPr>
-              <w:lastRenderedPageBreak/>
               <w:t>1.C — Tableau de bord web centralisé</w:t>
             </w:r>
           </w:p>
@@ -3434,7 +3702,14 @@
               <w:rPr>
                 <w:color w:val="EE0000"/>
               </w:rPr>
-              <w:t>1.D — Repositionnement stratégique surveillants</w:t>
+              <w:t xml:space="preserve">1.D — Repositionnement </w:t>
+            </w:r>
+            <w:r>
+              <w:rPr>
+                <w:color w:val="EE0000"/>
+              </w:rPr>
+              <w:lastRenderedPageBreak/>
+              <w:t>stratégique surveillants</w:t>
             </w:r>
           </w:p>
         </w:tc>
@@ -3452,6 +3727,7 @@
               <w:rPr>
                 <w:color w:val="EE0000"/>
               </w:rPr>
+              <w:lastRenderedPageBreak/>
               <w:t>5</w:t>
             </w:r>
           </w:p>
@@ -3554,7 +3830,10 @@
           </w:tcPr>
           <w:p>
             <w:r>
-              <w:t>2.A — Enregistrement vidéo local horodaté</w:t>
+              <w:t xml:space="preserve">2.A — </w:t>
+            </w:r>
+            <w:r>
+              <w:t>Enregistrement vidéo local horodaté</w:t>
             </w:r>
           </w:p>
         </w:tc>
@@ -3869,7 +4148,10 @@
           </w:tcPr>
           <w:p>
             <w:r>
-              <w:t>3.A — Architecture LAN 100% (MotionEye/Frigate)</w:t>
+              <w:t xml:space="preserve">3.A — </w:t>
+            </w:r>
+            <w:r>
+              <w:t>Architecture LAN 100% (MotionEye/Frigate)</w:t>
             </w:r>
           </w:p>
         </w:tc>
@@ -4421,7 +4703,13 @@
               <w:rPr>
                 <w:lang w:val="fr-SN"/>
               </w:rPr>
-              <w:t>6.B — Projet étudiant NVR open-source</w:t>
+              <w:t xml:space="preserve">6.B — Projet étudiant NVR </w:t>
+            </w:r>
+            <w:r>
+              <w:rPr>
+                <w:lang w:val="fr-SN"/>
+              </w:rPr>
+              <w:t>open-source</w:t>
             </w:r>
           </w:p>
         </w:tc>
@@ -4584,7 +4872,7 @@
     <w:p/>
     <w:p>
       <w:pPr>
-        <w:pStyle w:val="Heading1"/>
+        <w:pStyle w:val="Titre1"/>
         <w:rPr>
           <w:lang w:val="fr-SN"/>
         </w:rPr>
@@ -4593,7 +4881,6 @@
         <w:rPr>
           <w:lang w:val="fr-SN"/>
         </w:rPr>
-        <w:lastRenderedPageBreak/>
         <w:t>3. IDÉES RETENUES — Prêtes pour le prototypage</w:t>
       </w:r>
     </w:p>
@@ -4607,12 +4894,18 @@
         <w:rPr>
           <w:lang w:val="fr-SN"/>
         </w:rPr>
-        <w:t>Les cinq idées ci-dessous ont été sélectionnées sur la base de la matrice (score ≥ 17/20), de leur complémentarité et de leur cohérence avec la contrainte zéro budget étudiants.</w:t>
+        <w:t>Les cinq idées ci-dessous ont été sélectionnées sur la base de la matrice (score ≥ 17/20), de leur</w:t>
+      </w:r>
+      <w:r>
+        <w:rPr>
+          <w:lang w:val="fr-SN"/>
+        </w:rPr>
+        <w:t xml:space="preserve"> complémentarité et de leur cohérence avec la contrainte zéro budget étudiants.</w:t>
       </w:r>
     </w:p>
     <w:p>
       <w:pPr>
-        <w:pStyle w:val="Heading2"/>
+        <w:pStyle w:val="Titre2"/>
         <w:rPr>
           <w:lang w:val="fr-SN"/>
         </w:rPr>
@@ -4621,12 +4914,13 @@
         <w:rPr>
           <w:lang w:val="fr-SN"/>
         </w:rPr>
+        <w:lastRenderedPageBreak/>
         <w:t>Idée retenue 1 — Système de vidéosurveillance local (NVR open-source)</w:t>
       </w:r>
     </w:p>
     <w:p>
       <w:pPr>
-        <w:pStyle w:val="ListBullet"/>
+        <w:pStyle w:val="Listepuces"/>
         <w:rPr>
           <w:lang w:val="fr-SN"/>
         </w:rPr>
@@ -4640,7 +4934,7 @@
     </w:p>
     <w:p>
       <w:pPr>
-        <w:pStyle w:val="ListBullet"/>
+        <w:pStyle w:val="Listepuces"/>
         <w:rPr>
           <w:lang w:val="fr-SN"/>
         </w:rPr>
@@ -4677,12 +4971,18 @@
         <w:rPr>
           <w:lang w:val="fr-SN"/>
         </w:rPr>
-        <w:t xml:space="preserve"> (logiciels libres) sur un vieux serveur/PC existant</w:t>
+        <w:t xml:space="preserve"> (lo</w:t>
+      </w:r>
+      <w:r>
+        <w:rPr>
+          <w:lang w:val="fr-SN"/>
+        </w:rPr>
+        <w:t>giciels libres) sur un vieux serveur/PC existant</w:t>
       </w:r>
     </w:p>
     <w:p>
       <w:pPr>
-        <w:pStyle w:val="ListBullet"/>
+        <w:pStyle w:val="Listepuces"/>
         <w:rPr>
           <w:lang w:val="fr-SN"/>
         </w:rPr>
@@ -4696,7 +4996,7 @@
     </w:p>
     <w:p>
       <w:pPr>
-        <w:pStyle w:val="ListBullet"/>
+        <w:pStyle w:val="Listepuces"/>
         <w:rPr>
           <w:lang w:val="fr-SN"/>
         </w:rPr>
@@ -4710,7 +5010,7 @@
     </w:p>
     <w:p>
       <w:pPr>
-        <w:pStyle w:val="ListBullet"/>
+        <w:pStyle w:val="Listepuces"/>
         <w:rPr>
           <w:lang w:val="fr-SN"/>
         </w:rPr>
@@ -4719,12 +5019,18 @@
         <w:rPr>
           <w:lang w:val="fr-SN"/>
         </w:rPr>
-        <w:t>Réalisé par : étudiants en informatique dans le cadre d'un projet de fin d'études</w:t>
+        <w:t>Réalisé par : étudiants en informatique dans le cadre d'un pro</w:t>
+      </w:r>
+      <w:r>
+        <w:rPr>
+          <w:lang w:val="fr-SN"/>
+        </w:rPr>
+        <w:t>jet de fin d'études</w:t>
       </w:r>
     </w:p>
     <w:p>
       <w:pPr>
-        <w:pStyle w:val="Heading2"/>
+        <w:pStyle w:val="Titre2"/>
         <w:rPr>
           <w:lang w:val="fr-SN"/>
         </w:rPr>
@@ -4738,7 +5044,7 @@
     </w:p>
     <w:p>
       <w:pPr>
-        <w:pStyle w:val="ListBullet"/>
+        <w:pStyle w:val="Listepuces"/>
         <w:rPr>
           <w:lang w:val="fr-SN"/>
         </w:rPr>
@@ -4752,7 +5058,7 @@
     </w:p>
     <w:p>
       <w:pPr>
-        <w:pStyle w:val="ListBullet"/>
+        <w:pStyle w:val="Listepuces"/>
         <w:rPr>
           <w:lang w:val="fr-SN"/>
         </w:rPr>
@@ -4761,12 +5067,18 @@
         <w:rPr>
           <w:lang w:val="fr-SN"/>
         </w:rPr>
-        <w:t>Génération automatique de rapport PDF horodaté avec captures vidéo correspondantes</w:t>
+        <w:t xml:space="preserve">Génération automatique de rapport PDF horodaté avec captures vidéo </w:t>
+      </w:r>
+      <w:r>
+        <w:rPr>
+          <w:lang w:val="fr-SN"/>
+        </w:rPr>
+        <w:t>correspondantes</w:t>
       </w:r>
     </w:p>
     <w:p>
       <w:pPr>
-        <w:pStyle w:val="ListBullet"/>
+        <w:pStyle w:val="Listepuces"/>
         <w:rPr>
           <w:lang w:val="fr-SN"/>
         </w:rPr>
@@ -4780,7 +5092,7 @@
     </w:p>
     <w:p>
       <w:pPr>
-        <w:pStyle w:val="ListBullet"/>
+        <w:pStyle w:val="Listepuces"/>
         <w:rPr>
           <w:lang w:val="fr-SN"/>
         </w:rPr>
@@ -4794,7 +5106,7 @@
     </w:p>
     <w:p>
       <w:pPr>
-        <w:pStyle w:val="ListBullet"/>
+        <w:pStyle w:val="Listepuces"/>
         <w:rPr>
           <w:lang w:val="fr-SN"/>
         </w:rPr>
@@ -4808,7 +5120,7 @@
     </w:p>
     <w:p>
       <w:pPr>
-        <w:pStyle w:val="Heading2"/>
+        <w:pStyle w:val="Titre2"/>
         <w:rPr>
           <w:lang w:val="fr-SN"/>
         </w:rPr>
@@ -4817,12 +5129,18 @@
         <w:rPr>
           <w:lang w:val="fr-SN"/>
         </w:rPr>
-        <w:t>Idée retenue 3 — Smartphones du personnel comme caméras d'appoint</w:t>
+        <w:t>Idée retenue 3 — Smartphones du perso</w:t>
+      </w:r>
+      <w:r>
+        <w:rPr>
+          <w:lang w:val="fr-SN"/>
+        </w:rPr>
+        <w:t>nnel comme caméras d'appoint</w:t>
       </w:r>
     </w:p>
     <w:p>
       <w:pPr>
-        <w:pStyle w:val="ListBullet"/>
+        <w:pStyle w:val="Listepuces"/>
         <w:rPr>
           <w:lang w:val="fr-SN"/>
         </w:rPr>
@@ -4850,7 +5168,7 @@
     </w:p>
     <w:p>
       <w:pPr>
-        <w:pStyle w:val="ListBullet"/>
+        <w:pStyle w:val="Listepuces"/>
         <w:rPr>
           <w:lang w:val="fr-SN"/>
         </w:rPr>
@@ -4864,7 +5182,7 @@
     </w:p>
     <w:p>
       <w:pPr>
-        <w:pStyle w:val="ListBullet"/>
+        <w:pStyle w:val="Listepuces"/>
         <w:rPr>
           <w:lang w:val="fr-SN"/>
         </w:rPr>
@@ -4878,7 +5196,7 @@
     </w:p>
     <w:p>
       <w:pPr>
-        <w:pStyle w:val="ListBullet"/>
+        <w:pStyle w:val="Listepuces"/>
         <w:rPr>
           <w:lang w:val="fr-SN"/>
         </w:rPr>
@@ -4887,12 +5205,18 @@
         <w:rPr>
           <w:lang w:val="fr-SN"/>
         </w:rPr>
-        <w:t>Solution de transition pendant la réhabilitation progressive des caméras fixes</w:t>
+        <w:t>Solution d</w:t>
+      </w:r>
+      <w:r>
+        <w:rPr>
+          <w:lang w:val="fr-SN"/>
+        </w:rPr>
+        <w:t>e transition pendant la réhabilitation progressive des caméras fixes</w:t>
       </w:r>
     </w:p>
     <w:p>
       <w:pPr>
-        <w:pStyle w:val="ListBullet"/>
+        <w:pStyle w:val="Listepuces"/>
         <w:rPr>
           <w:lang w:val="fr-SN"/>
         </w:rPr>
@@ -4906,7 +5230,7 @@
     </w:p>
     <w:p>
       <w:pPr>
-        <w:pStyle w:val="Heading2"/>
+        <w:pStyle w:val="Titre2"/>
         <w:rPr>
           <w:lang w:val="fr-SN"/>
         </w:rPr>
@@ -4920,7 +5244,7 @@
     </w:p>
     <w:p>
       <w:pPr>
-        <w:pStyle w:val="ListBullet"/>
+        <w:pStyle w:val="Listepuces"/>
         <w:rPr>
           <w:lang w:val="fr-SN"/>
         </w:rPr>
@@ -4929,12 +5253,18 @@
         <w:rPr>
           <w:lang w:val="fr-SN"/>
         </w:rPr>
-        <w:t>Charte officielle rédigée par les étudiants, validée par le rectorat et le directeur d'UFR</w:t>
+        <w:t>Charte officielle rédigée par les étudiants,</w:t>
+      </w:r>
+      <w:r>
+        <w:rPr>
+          <w:lang w:val="fr-SN"/>
+        </w:rPr>
+        <w:t xml:space="preserve"> validée par le rectorat et le directeur d'UFR</w:t>
       </w:r>
     </w:p>
     <w:p>
       <w:pPr>
-        <w:pStyle w:val="ListBullet"/>
+        <w:pStyle w:val="Listepuces"/>
         <w:rPr>
           <w:lang w:val="fr-SN"/>
         </w:rPr>
@@ -4948,7 +5278,7 @@
     </w:p>
     <w:p>
       <w:pPr>
-        <w:pStyle w:val="ListBullet"/>
+        <w:pStyle w:val="Listepuces"/>
         <w:rPr>
           <w:lang w:val="fr-SN"/>
         </w:rPr>
@@ -4962,7 +5292,7 @@
     </w:p>
     <w:p>
       <w:pPr>
-        <w:pStyle w:val="ListBullet"/>
+        <w:pStyle w:val="Listepuces"/>
         <w:rPr>
           <w:lang w:val="fr-SN"/>
         </w:rPr>
@@ -4971,12 +5301,18 @@
         <w:rPr>
           <w:lang w:val="fr-SN"/>
         </w:rPr>
-        <w:t>Politique de rétention automatique : suppression des vidéos après 30 jours sauf procédure disciplinaire</w:t>
+        <w:t>Politique de rétention automatique : suppressio</w:t>
+      </w:r>
+      <w:r>
+        <w:rPr>
+          <w:lang w:val="fr-SN"/>
+        </w:rPr>
+        <w:t>n des vidéos après 30 jours sauf procédure disciplinaire</w:t>
       </w:r>
     </w:p>
     <w:p>
       <w:pPr>
-        <w:pStyle w:val="ListBullet"/>
+        <w:pStyle w:val="Listepuces"/>
         <w:rPr>
           <w:lang w:val="fr-SN"/>
         </w:rPr>
@@ -4990,7 +5326,7 @@
     </w:p>
     <w:p>
       <w:pPr>
-        <w:pStyle w:val="Heading2"/>
+        <w:pStyle w:val="Titre2"/>
         <w:rPr>
           <w:lang w:val="fr-SN"/>
         </w:rPr>
@@ -5018,7 +5354,7 @@
     </w:p>
     <w:p>
       <w:pPr>
-        <w:pStyle w:val="ListBullet"/>
+        <w:pStyle w:val="Listepuces"/>
         <w:rPr>
           <w:lang w:val="fr-SN"/>
         </w:rPr>
@@ -5027,12 +5363,18 @@
         <w:rPr>
           <w:lang w:val="fr-SN"/>
         </w:rPr>
-        <w:t>Donner une seconde vie aux anciens PC de l'UFR inutilisés</w:t>
+        <w:t>Donner une seconde vie aux anciens PC de l'UFR</w:t>
+      </w:r>
+      <w:r>
+        <w:rPr>
+          <w:lang w:val="fr-SN"/>
+        </w:rPr>
+        <w:t xml:space="preserve"> inutilisés</w:t>
       </w:r>
     </w:p>
     <w:p>
       <w:pPr>
-        <w:pStyle w:val="ListBullet"/>
+        <w:pStyle w:val="Listepuces"/>
         <w:rPr>
           <w:lang w:val="fr-SN"/>
         </w:rPr>
@@ -5068,7 +5410,7 @@
     </w:p>
     <w:p>
       <w:pPr>
-        <w:pStyle w:val="ListBullet"/>
+        <w:pStyle w:val="Listepuces"/>
         <w:rPr>
           <w:lang w:val="fr-SN"/>
         </w:rPr>
@@ -5082,7 +5424,7 @@
     </w:p>
     <w:p>
       <w:pPr>
-        <w:pStyle w:val="ListBullet"/>
+        <w:pStyle w:val="Listepuces"/>
         <w:rPr>
           <w:lang w:val="fr-SN"/>
         </w:rPr>
@@ -5091,12 +5433,18 @@
         <w:rPr>
           <w:lang w:val="fr-SN"/>
         </w:rPr>
-        <w:t>Maintenance assurée par le service informatique formé par les étudiants (transfert de compétences)</w:t>
+        <w:t>Maintenance assurée par le service informatique formé par les étudiants (transfert de c</w:t>
+      </w:r>
+      <w:r>
+        <w:rPr>
+          <w:lang w:val="fr-SN"/>
+        </w:rPr>
+        <w:t>ompétences)</w:t>
       </w:r>
     </w:p>
     <w:p>
       <w:pPr>
-        <w:pStyle w:val="ListBullet"/>
+        <w:pStyle w:val="Listepuces"/>
         <w:rPr>
           <w:lang w:val="fr-SN"/>
         </w:rPr>
@@ -5108,10 +5456,16 @@
         <w:t>Réalisé par : étudiants en administration système</w:t>
       </w:r>
     </w:p>
-    <w:p/>
     <w:p>
       <w:pPr>
-        <w:pStyle w:val="Heading1"/>
+        <w:rPr>
+          <w:lang w:val="fr-FR"/>
+        </w:rPr>
+      </w:pPr>
+    </w:p>
+    <w:p>
+      <w:pPr>
+        <w:pStyle w:val="Titre1"/>
         <w:rPr>
           <w:lang w:val="fr-SN"/>
         </w:rPr>
@@ -5134,12 +5488,18 @@
         <w:rPr>
           <w:lang w:val="fr-SN"/>
         </w:rPr>
-        <w:t>Les cinq idées retenues ne sont pas indépendantes : elles forment les modules complémentaires d'un seul et même système intégré de télésurveillance des examens, réalisable progressivement par les étudiants sans budget externe.</w:t>
+        <w:t>Les cinq idées retenues ne sont pas indépendantes : elles forment les modules complémentaires d'un seul et même système intégré de télésurveillan</w:t>
+      </w:r>
+      <w:r>
+        <w:rPr>
+          <w:lang w:val="fr-SN"/>
+        </w:rPr>
+        <w:t>ce des examens, réalisable progressivement par les étudiants sans budget externe.</w:t>
       </w:r>
     </w:p>
     <w:tbl>
       <w:tblPr>
-        <w:tblStyle w:val="TableGrid"/>
+        <w:tblStyle w:val="Grilledutableau"/>
         <w:tblW w:w="0" w:type="auto"/>
         <w:tblLook w:val="04A0" w:firstRow="1" w:lastRow="0" w:firstColumn="1" w:lastColumn="0" w:noHBand="0" w:noVBand="1"/>
       </w:tblPr>
@@ -5224,7 +5584,13 @@
               <w:rPr>
                 <w:lang w:val="fr-SN"/>
               </w:rPr>
-              <w:t>MODULE 2 — Surveillance temps réel</w:t>
+              <w:t xml:space="preserve">MODULE 2 — Surveillance temps </w:t>
+            </w:r>
+            <w:r>
+              <w:rPr>
+                <w:lang w:val="fr-SN"/>
+              </w:rPr>
+              <w:t>réel</w:t>
             </w:r>
             <w:r>
               <w:rPr>
@@ -5321,7 +5687,13 @@
                 <w:lang w:val="fr-SN"/>
               </w:rPr>
               <w:br/>
-              <w:t>(Idée 4)</w:t>
+              <w:t>(I</w:t>
+            </w:r>
+            <w:r>
+              <w:rPr>
+                <w:lang w:val="fr-SN"/>
+              </w:rPr>
+              <w:t>dée 4)</w:t>
             </w:r>
           </w:p>
         </w:tc>
@@ -5354,7 +5726,7 @@
     </w:p>
     <w:p>
       <w:pPr>
-        <w:pStyle w:val="Heading1"/>
+        <w:pStyle w:val="Titre1"/>
         <w:rPr>
           <w:lang w:val="fr-SN"/>
         </w:rPr>
@@ -5376,12 +5748,26 @@
         <w:rPr>
           <w:lang w:val="fr-SN"/>
         </w:rPr>
-        <w:t>La prochaine étape consiste à prototyper le Module 1 (Infrastructure) en priorité, car il constitue le socle technique de l'ensemble du système. Sans caméras fonctionnelles et sans serveur de stockage, aucun des autres modules ne peut exister.</w:t>
+        <w:t>La prochaine étape consiste à prototyper le Module 1 (Infrastructure) en priorité, car il constitue le socle technique de l'ensem</w:t>
+      </w:r>
+      <w:r>
+        <w:rPr>
+          <w:lang w:val="fr-SN"/>
+        </w:rPr>
+        <w:t>ble du système. Sans caméras fonctionn</w:t>
+      </w:r>
+      <w:bookmarkStart w:id="0" w:name="_GoBack"/>
+      <w:bookmarkEnd w:id="0"/>
+      <w:r>
+        <w:rPr>
+          <w:lang w:val="fr-SN"/>
+        </w:rPr>
+        <w:t>elles et sans serveur de stockage, aucun des autres modules ne peut exister.</w:t>
       </w:r>
     </w:p>
     <w:p>
       <w:pPr>
-        <w:pStyle w:val="ListNumber"/>
+        <w:pStyle w:val="Listenumros"/>
         <w:rPr>
           <w:lang w:val="fr-SN"/>
         </w:rPr>
@@ -5390,12 +5776,26 @@
         <w:rPr>
           <w:lang w:val="fr-SN"/>
         </w:rPr>
-        <w:t>Étape 1 — Diagnostic des caméras existantes : identifier lesquelles sont réparables vs. à remplacer (projet étudiant encadré)</w:t>
+        <w:t xml:space="preserve">Étape 1 — Diagnostic des caméras existantes : identifier lesquelles sont réparables vs. </w:t>
+      </w:r>
+      <w:proofErr w:type="gramStart"/>
+      <w:r>
+        <w:rPr>
+          <w:lang w:val="fr-SN"/>
+        </w:rPr>
+        <w:t>à</w:t>
+      </w:r>
+      <w:proofErr w:type="gramEnd"/>
+      <w:r>
+        <w:rPr>
+          <w:lang w:val="fr-SN"/>
+        </w:rPr>
+        <w:t xml:space="preserve"> remplacer (projet étudiant encadré)</w:t>
       </w:r>
     </w:p>
     <w:p>
       <w:pPr>
-        <w:pStyle w:val="ListNumber"/>
+        <w:pStyle w:val="Listenumros"/>
         <w:rPr>
           <w:lang w:val="fr-SN"/>
         </w:rPr>
@@ -5404,7 +5804,13 @@
         <w:rPr>
           <w:lang w:val="fr-SN"/>
         </w:rPr>
-        <w:t xml:space="preserve">Étape 2 — Installation du NVR open-source sur un vieux PC de l'UFR : </w:t>
+        <w:t>Étape 2 — Insta</w:t>
+      </w:r>
+      <w:r>
+        <w:rPr>
+          <w:lang w:val="fr-SN"/>
+        </w:rPr>
+        <w:t xml:space="preserve">llation du NVR open-source sur un vieux PC de l'UFR : </w:t>
       </w:r>
       <w:proofErr w:type="spellStart"/>
       <w:r>
@@ -5437,7 +5843,7 @@
     </w:p>
     <w:p>
       <w:pPr>
-        <w:pStyle w:val="ListNumber"/>
+        <w:pStyle w:val="Listenumros"/>
         <w:rPr>
           <w:lang w:val="fr-SN"/>
         </w:rPr>
@@ -5465,7 +5871,7 @@
     </w:p>
     <w:p>
       <w:pPr>
-        <w:pStyle w:val="ListNumber"/>
+        <w:pStyle w:val="Listenumros"/>
         <w:rPr>
           <w:lang w:val="fr-SN"/>
         </w:rPr>
@@ -5474,12 +5880,18 @@
         <w:rPr>
           <w:lang w:val="fr-SN"/>
         </w:rPr>
-        <w:t>Étape 4 — Test du système sur 1 salle pilote avant déploiement généralisé</w:t>
+        <w:t>Étape 4 — Test du système sur 1 salle pilote avant déploiement générali</w:t>
+      </w:r>
+      <w:r>
+        <w:rPr>
+          <w:lang w:val="fr-SN"/>
+        </w:rPr>
+        <w:t>sé</w:t>
       </w:r>
     </w:p>
     <w:p>
       <w:pPr>
-        <w:pStyle w:val="ListNumber"/>
+        <w:pStyle w:val="Listenumros"/>
         <w:rPr>
           <w:lang w:val="fr-SN"/>
         </w:rPr>
@@ -5538,7 +5950,7 @@
 </file>
 
 <file path=word/numbering.xml><?xml version="1.0" encoding="utf-8"?>
-<w:numbering xmlns:wpc="http://schemas.microsoft.com/office/word/2010/wordprocessingCanvas" xmlns:cx="http://schemas.microsoft.com/office/drawing/2014/chartex" xmlns:cx1="http://schemas.microsoft.com/office/drawing/2015/9/8/chartex" xmlns:cx2="http://schemas.microsoft.com/office/drawing/2015/10/21/chartex" xmlns:cx3="http://schemas.microsoft.com/office/drawing/2016/5/9/chartex" xmlns:cx4="http://schemas.microsoft.com/office/drawing/2016/5/10/chartex" xmlns:cx5="http://schemas.microsoft.com/office/drawing/2016/5/11/chartex" xmlns:cx6="http://schemas.microsoft.com/office/drawing/2016/5/12/chartex" xmlns:cx7="http://schemas.microsoft.com/office/drawing/2016/5/13/chartex" xmlns:cx8="http://schemas.microsoft.com/office/drawing/2016/5/14/chartex" xmlns:mc="http://schemas.openxmlformats.org/markup-compatibility/2006" xmlns:aink="http://schemas.microsoft.com/office/drawing/2016/ink" xmlns:am3d="http://schemas.microsoft.com/office/drawing/2017/model3d" xmlns:o="urn:schemas-microsoft-com:office:office" xmlns:oel="http://schemas.microsoft.com/office/2019/extlst" xmlns:r="http://schemas.openxmlformats.org/officeDocument/2006/relationships" xmlns:m="http://schemas.openxmlformats.org/officeDocument/2006/math" xmlns:v="urn:schemas-microsoft-com:vml" xmlns:wp14="http://schemas.microsoft.com/office/word/2010/wordprocessingDrawing" xmlns:wp="http://schemas.openxmlformats.org/drawingml/2006/wordprocessingDrawing" xmlns:w10="urn:schemas-microsoft-com:office:word" xmlns:w="http://schemas.openxmlformats.org/wordprocessingml/2006/main" xmlns:w14="http://schemas.microsoft.com/office/word/2010/wordml" xmlns:w15="http://schemas.microsoft.com/office/word/2012/wordml" xmlns:w16cex="http://schemas.microsoft.com/office/word/2018/wordml/cex" xmlns:w16cid="http://schemas.microsoft.com/office/word/2016/wordml/cid" xmlns:w16="http://schemas.microsoft.com/office/word/2018/wordml" xmlns:w16du="http://schemas.microsoft.com/office/word/2023/wordml/word16du" xmlns:w16sdtdh="http://schemas.microsoft.com/office/word/2020/wordml/sdtdatahash" xmlns:w16sdtfl="http://schemas.microsoft.com/office/word/2024/wordml/sdtformatlock" xmlns:w16se="http://schemas.microsoft.com/office/word/2015/wordml/symex" xmlns:wpg="http://schemas.microsoft.com/office/word/2010/wordprocessingGroup" xmlns:wpi="http://schemas.microsoft.com/office/word/2010/wordprocessingInk" xmlns:wne="http://schemas.microsoft.com/office/word/2006/wordml" xmlns:wps="http://schemas.microsoft.com/office/word/2010/wordprocessingShape" mc:Ignorable="w14 w15 w16se w16cid w16 w16cex w16sdtdh w16sdtfl w16du wp14">
+<w:numbering xmlns:wpc="http://schemas.microsoft.com/office/word/2010/wordprocessingCanvas" xmlns:cx="http://schemas.microsoft.com/office/drawing/2014/chartex" xmlns:cx1="http://schemas.microsoft.com/office/drawing/2015/9/8/chartex" xmlns:mc="http://schemas.openxmlformats.org/markup-compatibility/2006" xmlns:o="urn:schemas-microsoft-com:office:office" xmlns:r="http://schemas.openxmlformats.org/officeDocument/2006/relationships" xmlns:m="http://schemas.openxmlformats.org/officeDocument/2006/math" xmlns:v="urn:schemas-microsoft-com:vml" xmlns:wp14="http://schemas.microsoft.com/office/word/2010/wordprocessingDrawing" xmlns:wp="http://schemas.openxmlformats.org/drawingml/2006/wordprocessingDrawing" xmlns:w10="urn:schemas-microsoft-com:office:word" xmlns:w="http://schemas.openxmlformats.org/wordprocessingml/2006/main" xmlns:w14="http://schemas.microsoft.com/office/word/2010/wordml" xmlns:w15="http://schemas.microsoft.com/office/word/2012/wordml" xmlns:w16se="http://schemas.microsoft.com/office/word/2015/wordml/symex" xmlns:wpg="http://schemas.microsoft.com/office/word/2010/wordprocessingGroup" xmlns:wpi="http://schemas.microsoft.com/office/word/2010/wordprocessingInk" xmlns:wne="http://schemas.microsoft.com/office/word/2006/wordml" xmlns:wps="http://schemas.microsoft.com/office/word/2010/wordprocessingShape" mc:Ignorable="w14 w15 w16se wp14">
   <w:abstractNum w:abstractNumId="0" w15:restartNumberingAfterBreak="0">
     <w:nsid w:val="FFFFFF7C"/>
     <w:multiLevelType w:val="singleLevel"/>
@@ -5580,7 +5992,7 @@
     <w:lvl w:ilvl="0">
       <w:start w:val="1"/>
       <w:numFmt w:val="decimal"/>
-      <w:pStyle w:val="ListNumber3"/>
+      <w:pStyle w:val="Listenumros3"/>
       <w:lvlText w:val="%1."/>
       <w:lvlJc w:val="left"/>
       <w:pPr>
@@ -5598,7 +6010,7 @@
     <w:lvl w:ilvl="0">
       <w:start w:val="1"/>
       <w:numFmt w:val="decimal"/>
-      <w:pStyle w:val="ListNumber2"/>
+      <w:pStyle w:val="Listenumros2"/>
       <w:lvlText w:val="%1."/>
       <w:lvlJc w:val="left"/>
       <w:pPr>
@@ -5636,7 +6048,7 @@
     <w:lvl w:ilvl="0">
       <w:start w:val="1"/>
       <w:numFmt w:val="bullet"/>
-      <w:pStyle w:val="ListBullet3"/>
+      <w:pStyle w:val="Listepuces3"/>
       <w:lvlText w:val=""/>
       <w:lvlJc w:val="left"/>
       <w:pPr>
@@ -5657,7 +6069,7 @@
     <w:lvl w:ilvl="0">
       <w:start w:val="1"/>
       <w:numFmt w:val="bullet"/>
-      <w:pStyle w:val="ListBullet2"/>
+      <w:pStyle w:val="Listepuces2"/>
       <w:lvlText w:val=""/>
       <w:lvlJc w:val="left"/>
       <w:pPr>
@@ -5678,7 +6090,7 @@
     <w:lvl w:ilvl="0">
       <w:start w:val="1"/>
       <w:numFmt w:val="decimal"/>
-      <w:pStyle w:val="ListNumber"/>
+      <w:pStyle w:val="Listenumros"/>
       <w:lvlText w:val="%1."/>
       <w:lvlJc w:val="left"/>
       <w:pPr>
@@ -5696,7 +6108,7 @@
     <w:lvl w:ilvl="0">
       <w:start w:val="1"/>
       <w:numFmt w:val="bullet"/>
-      <w:pStyle w:val="ListBullet"/>
+      <w:pStyle w:val="Listepuces"/>
       <w:lvlText w:val=""/>
       <w:lvlJc w:val="left"/>
       <w:pPr>
@@ -5710,38 +6122,38 @@
       </w:rPr>
     </w:lvl>
   </w:abstractNum>
-  <w:num w:numId="1" w16cid:durableId="2070110760">
+  <w:num w:numId="1">
     <w:abstractNumId w:val="8"/>
   </w:num>
-  <w:num w:numId="2" w16cid:durableId="998771508">
+  <w:num w:numId="2">
     <w:abstractNumId w:val="6"/>
   </w:num>
-  <w:num w:numId="3" w16cid:durableId="1013264677">
+  <w:num w:numId="3">
     <w:abstractNumId w:val="5"/>
   </w:num>
-  <w:num w:numId="4" w16cid:durableId="1072850812">
+  <w:num w:numId="4">
     <w:abstractNumId w:val="4"/>
   </w:num>
-  <w:num w:numId="5" w16cid:durableId="375006841">
+  <w:num w:numId="5">
     <w:abstractNumId w:val="7"/>
   </w:num>
-  <w:num w:numId="6" w16cid:durableId="786970611">
+  <w:num w:numId="6">
     <w:abstractNumId w:val="3"/>
   </w:num>
-  <w:num w:numId="7" w16cid:durableId="727219795">
+  <w:num w:numId="7">
     <w:abstractNumId w:val="2"/>
   </w:num>
-  <w:num w:numId="8" w16cid:durableId="1735464132">
+  <w:num w:numId="8">
     <w:abstractNumId w:val="1"/>
   </w:num>
-  <w:num w:numId="9" w16cid:durableId="1677657059">
+  <w:num w:numId="9">
     <w:abstractNumId w:val="0"/>
   </w:num>
 </w:numbering>
 </file>
 
 <file path=word/styles.xml><?xml version="1.0" encoding="utf-8"?>
-<w:styles xmlns:mc="http://schemas.openxmlformats.org/markup-compatibility/2006" xmlns:r="http://schemas.openxmlformats.org/officeDocument/2006/relationships" xmlns:w="http://schemas.openxmlformats.org/wordprocessingml/2006/main" xmlns:w14="http://schemas.microsoft.com/office/word/2010/wordml" xmlns:w15="http://schemas.microsoft.com/office/word/2012/wordml" xmlns:w16cex="http://schemas.microsoft.com/office/word/2018/wordml/cex" xmlns:w16cid="http://schemas.microsoft.com/office/word/2016/wordml/cid" xmlns:w16="http://schemas.microsoft.com/office/word/2018/wordml" xmlns:w16du="http://schemas.microsoft.com/office/word/2023/wordml/word16du" xmlns:w16sdtdh="http://schemas.microsoft.com/office/word/2020/wordml/sdtdatahash" xmlns:w16sdtfl="http://schemas.microsoft.com/office/word/2024/wordml/sdtformatlock" xmlns:w16se="http://schemas.microsoft.com/office/word/2015/wordml/symex" mc:Ignorable="w14 w15 w16se w16cid w16 w16cex w16sdtdh w16sdtfl w16du">
+<w:styles xmlns:mc="http://schemas.openxmlformats.org/markup-compatibility/2006" xmlns:r="http://schemas.openxmlformats.org/officeDocument/2006/relationships" xmlns:w="http://schemas.openxmlformats.org/wordprocessingml/2006/main" xmlns:w14="http://schemas.microsoft.com/office/word/2010/wordml" xmlns:w15="http://schemas.microsoft.com/office/word/2012/wordml" xmlns:w16se="http://schemas.microsoft.com/office/word/2015/wordml/symex" mc:Ignorable="w14 w15 w16se">
   <w:docDefaults>
     <w:rPrDefault>
       <w:rPr>
@@ -5757,7 +6169,7 @@
       </w:pPr>
     </w:pPrDefault>
   </w:docDefaults>
-  <w:latentStyles w:defLockedState="0" w:defUIPriority="99" w:defSemiHidden="0" w:defUnhideWhenUsed="0" w:defQFormat="0" w:count="376">
+  <w:latentStyles w:defLockedState="0" w:defUIPriority="99" w:defSemiHidden="0" w:defUnhideWhenUsed="0" w:defQFormat="0" w:count="371">
     <w:lsdException w:name="Normal" w:uiPriority="0" w:qFormat="1"/>
     <w:lsdException w:name="heading 1" w:uiPriority="9" w:qFormat="1"/>
     <w:lsdException w:name="heading 2" w:semiHidden="1" w:uiPriority="9" w:unhideWhenUsed="1" w:qFormat="1"/>
@@ -6120,22 +6532,17 @@
     <w:lsdException w:name="List Table 5 Dark Accent 6" w:uiPriority="50"/>
     <w:lsdException w:name="List Table 6 Colorful Accent 6" w:uiPriority="51"/>
     <w:lsdException w:name="List Table 7 Colorful Accent 6" w:uiPriority="52"/>
-    <w:lsdException w:name="Mention" w:semiHidden="1" w:unhideWhenUsed="1"/>
-    <w:lsdException w:name="Smart Hyperlink" w:semiHidden="1" w:unhideWhenUsed="1"/>
-    <w:lsdException w:name="Hashtag" w:semiHidden="1" w:unhideWhenUsed="1"/>
-    <w:lsdException w:name="Unresolved Mention" w:semiHidden="1" w:unhideWhenUsed="1"/>
-    <w:lsdException w:name="Smart Link" w:semiHidden="1" w:unhideWhenUsed="1"/>
   </w:latentStyles>
   <w:style w:type="paragraph" w:default="1" w:styleId="Normal">
     <w:name w:val="Normal"/>
     <w:qFormat/>
     <w:rsid w:val="00FC693F"/>
   </w:style>
-  <w:style w:type="paragraph" w:styleId="Heading1">
+  <w:style w:type="paragraph" w:styleId="Titre1">
     <w:name w:val="heading 1"/>
     <w:basedOn w:val="Normal"/>
     <w:next w:val="Normal"/>
-    <w:link w:val="Heading1Char"/>
+    <w:link w:val="Titre1Car"/>
     <w:uiPriority w:val="9"/>
     <w:qFormat/>
     <w:rsid w:val="00FC693F"/>
@@ -6154,11 +6561,11 @@
       <w:szCs w:val="28"/>
     </w:rPr>
   </w:style>
-  <w:style w:type="paragraph" w:styleId="Heading2">
+  <w:style w:type="paragraph" w:styleId="Titre2">
     <w:name w:val="heading 2"/>
     <w:basedOn w:val="Normal"/>
     <w:next w:val="Normal"/>
-    <w:link w:val="Heading2Char"/>
+    <w:link w:val="Titre2Car"/>
     <w:uiPriority w:val="9"/>
     <w:unhideWhenUsed/>
     <w:qFormat/>
@@ -6178,11 +6585,11 @@
       <w:szCs w:val="26"/>
     </w:rPr>
   </w:style>
-  <w:style w:type="paragraph" w:styleId="Heading3">
+  <w:style w:type="paragraph" w:styleId="Titre3">
     <w:name w:val="heading 3"/>
     <w:basedOn w:val="Normal"/>
     <w:next w:val="Normal"/>
-    <w:link w:val="Heading3Char"/>
+    <w:link w:val="Titre3Car"/>
     <w:uiPriority w:val="9"/>
     <w:unhideWhenUsed/>
     <w:qFormat/>
@@ -6200,11 +6607,11 @@
       <w:color w:val="4F81BD" w:themeColor="accent1"/>
     </w:rPr>
   </w:style>
-  <w:style w:type="paragraph" w:styleId="Heading4">
+  <w:style w:type="paragraph" w:styleId="Titre4">
     <w:name w:val="heading 4"/>
     <w:basedOn w:val="Normal"/>
     <w:next w:val="Normal"/>
-    <w:link w:val="Heading4Char"/>
+    <w:link w:val="Titre4Car"/>
     <w:uiPriority w:val="9"/>
     <w:semiHidden/>
     <w:unhideWhenUsed/>
@@ -6225,11 +6632,11 @@
       <w:color w:val="4F81BD" w:themeColor="accent1"/>
     </w:rPr>
   </w:style>
-  <w:style w:type="paragraph" w:styleId="Heading5">
+  <w:style w:type="paragraph" w:styleId="Titre5">
     <w:name w:val="heading 5"/>
     <w:basedOn w:val="Normal"/>
     <w:next w:val="Normal"/>
-    <w:link w:val="Heading5Char"/>
+    <w:link w:val="Titre5Car"/>
     <w:uiPriority w:val="9"/>
     <w:semiHidden/>
     <w:unhideWhenUsed/>
@@ -6246,11 +6653,11 @@
       <w:color w:val="243F60" w:themeColor="accent1" w:themeShade="7F"/>
     </w:rPr>
   </w:style>
-  <w:style w:type="paragraph" w:styleId="Heading6">
+  <w:style w:type="paragraph" w:styleId="Titre6">
     <w:name w:val="heading 6"/>
     <w:basedOn w:val="Normal"/>
     <w:next w:val="Normal"/>
-    <w:link w:val="Heading6Char"/>
+    <w:link w:val="Titre6Car"/>
     <w:uiPriority w:val="9"/>
     <w:semiHidden/>
     <w:unhideWhenUsed/>
@@ -6269,11 +6676,11 @@
       <w:color w:val="243F60" w:themeColor="accent1" w:themeShade="7F"/>
     </w:rPr>
   </w:style>
-  <w:style w:type="paragraph" w:styleId="Heading7">
+  <w:style w:type="paragraph" w:styleId="Titre7">
     <w:name w:val="heading 7"/>
     <w:basedOn w:val="Normal"/>
     <w:next w:val="Normal"/>
-    <w:link w:val="Heading7Char"/>
+    <w:link w:val="Titre7Car"/>
     <w:uiPriority w:val="9"/>
     <w:semiHidden/>
     <w:unhideWhenUsed/>
@@ -6292,11 +6699,11 @@
       <w:color w:val="404040" w:themeColor="text1" w:themeTint="BF"/>
     </w:rPr>
   </w:style>
-  <w:style w:type="paragraph" w:styleId="Heading8">
+  <w:style w:type="paragraph" w:styleId="Titre8">
     <w:name w:val="heading 8"/>
     <w:basedOn w:val="Normal"/>
     <w:next w:val="Normal"/>
-    <w:link w:val="Heading8Char"/>
+    <w:link w:val="Titre8Car"/>
     <w:uiPriority w:val="9"/>
     <w:semiHidden/>
     <w:unhideWhenUsed/>
@@ -6315,11 +6722,11 @@
       <w:szCs w:val="20"/>
     </w:rPr>
   </w:style>
-  <w:style w:type="paragraph" w:styleId="Heading9">
+  <w:style w:type="paragraph" w:styleId="Titre9">
     <w:name w:val="heading 9"/>
     <w:basedOn w:val="Normal"/>
     <w:next w:val="Normal"/>
-    <w:link w:val="Heading9Char"/>
+    <w:link w:val="Titre9Car"/>
     <w:uiPriority w:val="9"/>
     <w:semiHidden/>
     <w:unhideWhenUsed/>
@@ -6340,13 +6747,13 @@
       <w:szCs w:val="20"/>
     </w:rPr>
   </w:style>
-  <w:style w:type="character" w:default="1" w:styleId="DefaultParagraphFont">
+  <w:style w:type="character" w:default="1" w:styleId="Policepardfaut">
     <w:name w:val="Default Paragraph Font"/>
     <w:uiPriority w:val="1"/>
     <w:semiHidden/>
     <w:unhideWhenUsed/>
   </w:style>
-  <w:style w:type="table" w:default="1" w:styleId="TableNormal">
+  <w:style w:type="table" w:default="1" w:styleId="TableauNormal">
     <w:name w:val="Normal Table"/>
     <w:uiPriority w:val="99"/>
     <w:semiHidden/>
@@ -6361,16 +6768,16 @@
       </w:tblCellMar>
     </w:tblPr>
   </w:style>
-  <w:style w:type="numbering" w:default="1" w:styleId="NoList">
+  <w:style w:type="numbering" w:default="1" w:styleId="Aucuneliste">
     <w:name w:val="No List"/>
     <w:uiPriority w:val="99"/>
     <w:semiHidden/>
     <w:unhideWhenUsed/>
   </w:style>
-  <w:style w:type="paragraph" w:styleId="Header">
+  <w:style w:type="paragraph" w:styleId="En-tte">
     <w:name w:val="header"/>
     <w:basedOn w:val="Normal"/>
-    <w:link w:val="HeaderChar"/>
+    <w:link w:val="En-tteCar"/>
     <w:uiPriority w:val="99"/>
     <w:unhideWhenUsed/>
     <w:rsid w:val="00E618BF"/>
@@ -6382,17 +6789,17 @@
       <w:spacing w:after="0" w:line="240" w:lineRule="auto"/>
     </w:pPr>
   </w:style>
-  <w:style w:type="character" w:customStyle="1" w:styleId="HeaderChar">
-    <w:name w:val="Header Char"/>
-    <w:basedOn w:val="DefaultParagraphFont"/>
-    <w:link w:val="Header"/>
+  <w:style w:type="character" w:customStyle="1" w:styleId="En-tteCar">
+    <w:name w:val="En-tête Car"/>
+    <w:basedOn w:val="Policepardfaut"/>
+    <w:link w:val="En-tte"/>
     <w:uiPriority w:val="99"/>
     <w:rsid w:val="00E618BF"/>
   </w:style>
-  <w:style w:type="paragraph" w:styleId="Footer">
+  <w:style w:type="paragraph" w:styleId="Pieddepage">
     <w:name w:val="footer"/>
     <w:basedOn w:val="Normal"/>
-    <w:link w:val="FooterChar"/>
+    <w:link w:val="PieddepageCar"/>
     <w:uiPriority w:val="99"/>
     <w:unhideWhenUsed/>
     <w:rsid w:val="00E618BF"/>
@@ -6404,14 +6811,14 @@
       <w:spacing w:after="0" w:line="240" w:lineRule="auto"/>
     </w:pPr>
   </w:style>
-  <w:style w:type="character" w:customStyle="1" w:styleId="FooterChar">
-    <w:name w:val="Footer Char"/>
-    <w:basedOn w:val="DefaultParagraphFont"/>
-    <w:link w:val="Footer"/>
+  <w:style w:type="character" w:customStyle="1" w:styleId="PieddepageCar">
+    <w:name w:val="Pied de page Car"/>
+    <w:basedOn w:val="Policepardfaut"/>
+    <w:link w:val="Pieddepage"/>
     <w:uiPriority w:val="99"/>
     <w:rsid w:val="00E618BF"/>
   </w:style>
-  <w:style w:type="paragraph" w:styleId="NoSpacing">
+  <w:style w:type="paragraph" w:styleId="Sansinterligne">
     <w:name w:val="No Spacing"/>
     <w:uiPriority w:val="1"/>
     <w:qFormat/>
@@ -6420,10 +6827,10 @@
       <w:spacing w:after="0" w:line="240" w:lineRule="auto"/>
     </w:pPr>
   </w:style>
-  <w:style w:type="character" w:customStyle="1" w:styleId="Heading1Char">
-    <w:name w:val="Heading 1 Char"/>
-    <w:basedOn w:val="DefaultParagraphFont"/>
-    <w:link w:val="Heading1"/>
+  <w:style w:type="character" w:customStyle="1" w:styleId="Titre1Car">
+    <w:name w:val="Titre 1 Car"/>
+    <w:basedOn w:val="Policepardfaut"/>
+    <w:link w:val="Titre1"/>
     <w:uiPriority w:val="9"/>
     <w:rsid w:val="00FC693F"/>
     <w:rPr>
@@ -6435,10 +6842,10 @@
       <w:szCs w:val="28"/>
     </w:rPr>
   </w:style>
-  <w:style w:type="character" w:customStyle="1" w:styleId="Heading2Char">
-    <w:name w:val="Heading 2 Char"/>
-    <w:basedOn w:val="DefaultParagraphFont"/>
-    <w:link w:val="Heading2"/>
+  <w:style w:type="character" w:customStyle="1" w:styleId="Titre2Car">
+    <w:name w:val="Titre 2 Car"/>
+    <w:basedOn w:val="Policepardfaut"/>
+    <w:link w:val="Titre2"/>
     <w:uiPriority w:val="9"/>
     <w:rsid w:val="00FC693F"/>
     <w:rPr>
@@ -6450,10 +6857,10 @@
       <w:szCs w:val="26"/>
     </w:rPr>
   </w:style>
-  <w:style w:type="character" w:customStyle="1" w:styleId="Heading3Char">
-    <w:name w:val="Heading 3 Char"/>
-    <w:basedOn w:val="DefaultParagraphFont"/>
-    <w:link w:val="Heading3"/>
+  <w:style w:type="character" w:customStyle="1" w:styleId="Titre3Car">
+    <w:name w:val="Titre 3 Car"/>
+    <w:basedOn w:val="Policepardfaut"/>
+    <w:link w:val="Titre3"/>
     <w:uiPriority w:val="9"/>
     <w:rsid w:val="00FC693F"/>
     <w:rPr>
@@ -6463,11 +6870,11 @@
       <w:color w:val="4F81BD" w:themeColor="accent1"/>
     </w:rPr>
   </w:style>
-  <w:style w:type="paragraph" w:styleId="Title">
+  <w:style w:type="paragraph" w:styleId="Titre">
     <w:name w:val="Title"/>
     <w:basedOn w:val="Normal"/>
     <w:next w:val="Normal"/>
-    <w:link w:val="TitleChar"/>
+    <w:link w:val="TitreCar"/>
     <w:uiPriority w:val="10"/>
     <w:qFormat/>
     <w:rsid w:val="00FC693F"/>
@@ -6487,10 +6894,10 @@
       <w:szCs w:val="52"/>
     </w:rPr>
   </w:style>
-  <w:style w:type="character" w:customStyle="1" w:styleId="TitleChar">
-    <w:name w:val="Title Char"/>
-    <w:basedOn w:val="DefaultParagraphFont"/>
-    <w:link w:val="Title"/>
+  <w:style w:type="character" w:customStyle="1" w:styleId="TitreCar">
+    <w:name w:val="Titre Car"/>
+    <w:basedOn w:val="Policepardfaut"/>
+    <w:link w:val="Titre"/>
     <w:uiPriority w:val="10"/>
     <w:rsid w:val="00FC693F"/>
     <w:rPr>
@@ -6502,11 +6909,11 @@
       <w:szCs w:val="52"/>
     </w:rPr>
   </w:style>
-  <w:style w:type="paragraph" w:styleId="Subtitle">
+  <w:style w:type="paragraph" w:styleId="Sous-titre">
     <w:name w:val="Subtitle"/>
     <w:basedOn w:val="Normal"/>
     <w:next w:val="Normal"/>
-    <w:link w:val="SubtitleChar"/>
+    <w:link w:val="Sous-titreCar"/>
     <w:uiPriority w:val="11"/>
     <w:qFormat/>
     <w:rsid w:val="00FC693F"/>
@@ -6525,10 +6932,10 @@
       <w:szCs w:val="24"/>
     </w:rPr>
   </w:style>
-  <w:style w:type="character" w:customStyle="1" w:styleId="SubtitleChar">
-    <w:name w:val="Subtitle Char"/>
-    <w:basedOn w:val="DefaultParagraphFont"/>
-    <w:link w:val="Subtitle"/>
+  <w:style w:type="character" w:customStyle="1" w:styleId="Sous-titreCar">
+    <w:name w:val="Sous-titre Car"/>
+    <w:basedOn w:val="Policepardfaut"/>
+    <w:link w:val="Sous-titre"/>
     <w:uiPriority w:val="11"/>
     <w:rsid w:val="00FC693F"/>
     <w:rPr>
@@ -6541,7 +6948,7 @@
       <w:szCs w:val="24"/>
     </w:rPr>
   </w:style>
-  <w:style w:type="paragraph" w:styleId="ListParagraph">
+  <w:style w:type="paragraph" w:styleId="Paragraphedeliste">
     <w:name w:val="List Paragraph"/>
     <w:basedOn w:val="Normal"/>
     <w:uiPriority w:val="34"/>
@@ -6552,10 +6959,10 @@
       <w:contextualSpacing/>
     </w:pPr>
   </w:style>
-  <w:style w:type="paragraph" w:styleId="BodyText">
+  <w:style w:type="paragraph" w:styleId="Corpsdetexte">
     <w:name w:val="Body Text"/>
     <w:basedOn w:val="Normal"/>
-    <w:link w:val="BodyTextChar"/>
+    <w:link w:val="CorpsdetexteCar"/>
     <w:uiPriority w:val="99"/>
     <w:unhideWhenUsed/>
     <w:rsid w:val="00AA1D8D"/>
@@ -6563,17 +6970,17 @@
       <w:spacing w:after="120"/>
     </w:pPr>
   </w:style>
-  <w:style w:type="character" w:customStyle="1" w:styleId="BodyTextChar">
-    <w:name w:val="Body Text Char"/>
-    <w:basedOn w:val="DefaultParagraphFont"/>
-    <w:link w:val="BodyText"/>
+  <w:style w:type="character" w:customStyle="1" w:styleId="CorpsdetexteCar">
+    <w:name w:val="Corps de texte Car"/>
+    <w:basedOn w:val="Policepardfaut"/>
+    <w:link w:val="Corpsdetexte"/>
     <w:uiPriority w:val="99"/>
     <w:rsid w:val="00AA1D8D"/>
   </w:style>
-  <w:style w:type="paragraph" w:styleId="BodyText2">
+  <w:style w:type="paragraph" w:styleId="Corpsdetexte2">
     <w:name w:val="Body Text 2"/>
     <w:basedOn w:val="Normal"/>
-    <w:link w:val="BodyText2Char"/>
+    <w:link w:val="Corpsdetexte2Car"/>
     <w:uiPriority w:val="99"/>
     <w:unhideWhenUsed/>
     <w:rsid w:val="00AA1D8D"/>
@@ -6581,17 +6988,17 @@
       <w:spacing w:after="120" w:line="480" w:lineRule="auto"/>
     </w:pPr>
   </w:style>
-  <w:style w:type="character" w:customStyle="1" w:styleId="BodyText2Char">
-    <w:name w:val="Body Text 2 Char"/>
-    <w:basedOn w:val="DefaultParagraphFont"/>
-    <w:link w:val="BodyText2"/>
+  <w:style w:type="character" w:customStyle="1" w:styleId="Corpsdetexte2Car">
+    <w:name w:val="Corps de texte 2 Car"/>
+    <w:basedOn w:val="Policepardfaut"/>
+    <w:link w:val="Corpsdetexte2"/>
     <w:uiPriority w:val="99"/>
     <w:rsid w:val="00AA1D8D"/>
   </w:style>
-  <w:style w:type="paragraph" w:styleId="BodyText3">
+  <w:style w:type="paragraph" w:styleId="Corpsdetexte3">
     <w:name w:val="Body Text 3"/>
     <w:basedOn w:val="Normal"/>
-    <w:link w:val="BodyText3Char"/>
+    <w:link w:val="Corpsdetexte3Car"/>
     <w:uiPriority w:val="99"/>
     <w:unhideWhenUsed/>
     <w:rsid w:val="00AA1D8D"/>
@@ -6603,10 +7010,10 @@
       <w:szCs w:val="16"/>
     </w:rPr>
   </w:style>
-  <w:style w:type="character" w:customStyle="1" w:styleId="BodyText3Char">
-    <w:name w:val="Body Text 3 Char"/>
-    <w:basedOn w:val="DefaultParagraphFont"/>
-    <w:link w:val="BodyText3"/>
+  <w:style w:type="character" w:customStyle="1" w:styleId="Corpsdetexte3Car">
+    <w:name w:val="Corps de texte 3 Car"/>
+    <w:basedOn w:val="Policepardfaut"/>
+    <w:link w:val="Corpsdetexte3"/>
     <w:uiPriority w:val="99"/>
     <w:rsid w:val="00AA1D8D"/>
     <w:rPr>
@@ -6614,7 +7021,7 @@
       <w:szCs w:val="16"/>
     </w:rPr>
   </w:style>
-  <w:style w:type="paragraph" w:styleId="List">
+  <w:style w:type="paragraph" w:styleId="Liste">
     <w:name w:val="List"/>
     <w:basedOn w:val="Normal"/>
     <w:uiPriority w:val="99"/>
@@ -6625,7 +7032,7 @@
       <w:contextualSpacing/>
     </w:pPr>
   </w:style>
-  <w:style w:type="paragraph" w:styleId="List2">
+  <w:style w:type="paragraph" w:styleId="Liste2">
     <w:name w:val="List 2"/>
     <w:basedOn w:val="Normal"/>
     <w:uiPriority w:val="99"/>
@@ -6636,7 +7043,7 @@
       <w:contextualSpacing/>
     </w:pPr>
   </w:style>
-  <w:style w:type="paragraph" w:styleId="List3">
+  <w:style w:type="paragraph" w:styleId="Liste3">
     <w:name w:val="List 3"/>
     <w:basedOn w:val="Normal"/>
     <w:uiPriority w:val="99"/>
@@ -6647,7 +7054,7 @@
       <w:contextualSpacing/>
     </w:pPr>
   </w:style>
-  <w:style w:type="paragraph" w:styleId="ListBullet">
+  <w:style w:type="paragraph" w:styleId="Listepuces">
     <w:name w:val="List Bullet"/>
     <w:basedOn w:val="Normal"/>
     <w:uiPriority w:val="99"/>
@@ -6660,7 +7067,7 @@
       <w:contextualSpacing/>
     </w:pPr>
   </w:style>
-  <w:style w:type="paragraph" w:styleId="ListBullet2">
+  <w:style w:type="paragraph" w:styleId="Listepuces2">
     <w:name w:val="List Bullet 2"/>
     <w:basedOn w:val="Normal"/>
     <w:uiPriority w:val="99"/>
@@ -6673,7 +7080,7 @@
       <w:contextualSpacing/>
     </w:pPr>
   </w:style>
-  <w:style w:type="paragraph" w:styleId="ListBullet3">
+  <w:style w:type="paragraph" w:styleId="Listepuces3">
     <w:name w:val="List Bullet 3"/>
     <w:basedOn w:val="Normal"/>
     <w:uiPriority w:val="99"/>
@@ -6686,7 +7093,7 @@
       <w:contextualSpacing/>
     </w:pPr>
   </w:style>
-  <w:style w:type="paragraph" w:styleId="ListNumber">
+  <w:style w:type="paragraph" w:styleId="Listenumros">
     <w:name w:val="List Number"/>
     <w:basedOn w:val="Normal"/>
     <w:uiPriority w:val="99"/>
@@ -6699,7 +7106,7 @@
       <w:contextualSpacing/>
     </w:pPr>
   </w:style>
-  <w:style w:type="paragraph" w:styleId="ListNumber2">
+  <w:style w:type="paragraph" w:styleId="Listenumros2">
     <w:name w:val="List Number 2"/>
     <w:basedOn w:val="Normal"/>
     <w:uiPriority w:val="99"/>
@@ -6712,7 +7119,7 @@
       <w:contextualSpacing/>
     </w:pPr>
   </w:style>
-  <w:style w:type="paragraph" w:styleId="ListNumber3">
+  <w:style w:type="paragraph" w:styleId="Listenumros3">
     <w:name w:val="List Number 3"/>
     <w:basedOn w:val="Normal"/>
     <w:uiPriority w:val="99"/>
@@ -6725,7 +7132,7 @@
       <w:contextualSpacing/>
     </w:pPr>
   </w:style>
-  <w:style w:type="paragraph" w:styleId="ListContinue">
+  <w:style w:type="paragraph" w:styleId="Listecontinue">
     <w:name w:val="List Continue"/>
     <w:basedOn w:val="Normal"/>
     <w:uiPriority w:val="99"/>
@@ -6737,7 +7144,7 @@
       <w:contextualSpacing/>
     </w:pPr>
   </w:style>
-  <w:style w:type="paragraph" w:styleId="ListContinue2">
+  <w:style w:type="paragraph" w:styleId="Listecontinue2">
     <w:name w:val="List Continue 2"/>
     <w:basedOn w:val="Normal"/>
     <w:uiPriority w:val="99"/>
@@ -6749,7 +7156,7 @@
       <w:contextualSpacing/>
     </w:pPr>
   </w:style>
-  <w:style w:type="paragraph" w:styleId="ListContinue3">
+  <w:style w:type="paragraph" w:styleId="Listecontinue3">
     <w:name w:val="List Continue 3"/>
     <w:basedOn w:val="Normal"/>
     <w:uiPriority w:val="99"/>
@@ -6761,9 +7168,9 @@
       <w:contextualSpacing/>
     </w:pPr>
   </w:style>
-  <w:style w:type="paragraph" w:styleId="MacroText">
+  <w:style w:type="paragraph" w:styleId="Textedemacro">
     <w:name w:val="macro"/>
-    <w:link w:val="MacroTextChar"/>
+    <w:link w:val="TextedemacroCar"/>
     <w:uiPriority w:val="99"/>
     <w:unhideWhenUsed/>
     <w:rsid w:val="0029639D"/>
@@ -6784,10 +7191,10 @@
       <w:szCs w:val="20"/>
     </w:rPr>
   </w:style>
-  <w:style w:type="character" w:customStyle="1" w:styleId="MacroTextChar">
-    <w:name w:val="Macro Text Char"/>
-    <w:basedOn w:val="DefaultParagraphFont"/>
-    <w:link w:val="MacroText"/>
+  <w:style w:type="character" w:customStyle="1" w:styleId="TextedemacroCar">
+    <w:name w:val="Texte de macro Car"/>
+    <w:basedOn w:val="Policepardfaut"/>
+    <w:link w:val="Textedemacro"/>
     <w:uiPriority w:val="99"/>
     <w:rsid w:val="0029639D"/>
     <w:rPr>
@@ -6796,11 +7203,11 @@
       <w:szCs w:val="20"/>
     </w:rPr>
   </w:style>
-  <w:style w:type="paragraph" w:styleId="Quote">
+  <w:style w:type="paragraph" w:styleId="Citation">
     <w:name w:val="Quote"/>
     <w:basedOn w:val="Normal"/>
     <w:next w:val="Normal"/>
-    <w:link w:val="QuoteChar"/>
+    <w:link w:val="CitationCar"/>
     <w:uiPriority w:val="29"/>
     <w:qFormat/>
     <w:rsid w:val="00FC693F"/>
@@ -6810,10 +7217,10 @@
       <w:color w:val="000000" w:themeColor="text1"/>
     </w:rPr>
   </w:style>
-  <w:style w:type="character" w:customStyle="1" w:styleId="QuoteChar">
-    <w:name w:val="Quote Char"/>
-    <w:basedOn w:val="DefaultParagraphFont"/>
-    <w:link w:val="Quote"/>
+  <w:style w:type="character" w:customStyle="1" w:styleId="CitationCar">
+    <w:name w:val="Citation Car"/>
+    <w:basedOn w:val="Policepardfaut"/>
+    <w:link w:val="Citation"/>
     <w:uiPriority w:val="29"/>
     <w:rsid w:val="00FC693F"/>
     <w:rPr>
@@ -6822,10 +7229,10 @@
       <w:color w:val="000000" w:themeColor="text1"/>
     </w:rPr>
   </w:style>
-  <w:style w:type="character" w:customStyle="1" w:styleId="Heading4Char">
-    <w:name w:val="Heading 4 Char"/>
-    <w:basedOn w:val="DefaultParagraphFont"/>
-    <w:link w:val="Heading4"/>
+  <w:style w:type="character" w:customStyle="1" w:styleId="Titre4Car">
+    <w:name w:val="Titre 4 Car"/>
+    <w:basedOn w:val="Policepardfaut"/>
+    <w:link w:val="Titre4"/>
     <w:uiPriority w:val="9"/>
     <w:semiHidden/>
     <w:rsid w:val="00FC693F"/>
@@ -6838,10 +7245,10 @@
       <w:color w:val="4F81BD" w:themeColor="accent1"/>
     </w:rPr>
   </w:style>
-  <w:style w:type="character" w:customStyle="1" w:styleId="Heading5Char">
-    <w:name w:val="Heading 5 Char"/>
-    <w:basedOn w:val="DefaultParagraphFont"/>
-    <w:link w:val="Heading5"/>
+  <w:style w:type="character" w:customStyle="1" w:styleId="Titre5Car">
+    <w:name w:val="Titre 5 Car"/>
+    <w:basedOn w:val="Policepardfaut"/>
+    <w:link w:val="Titre5"/>
     <w:uiPriority w:val="9"/>
     <w:semiHidden/>
     <w:rsid w:val="00FC693F"/>
@@ -6850,10 +7257,10 @@
       <w:color w:val="243F60" w:themeColor="accent1" w:themeShade="7F"/>
     </w:rPr>
   </w:style>
-  <w:style w:type="character" w:customStyle="1" w:styleId="Heading6Char">
-    <w:name w:val="Heading 6 Char"/>
-    <w:basedOn w:val="DefaultParagraphFont"/>
-    <w:link w:val="Heading6"/>
+  <w:style w:type="character" w:customStyle="1" w:styleId="Titre6Car">
+    <w:name w:val="Titre 6 Car"/>
+    <w:basedOn w:val="Policepardfaut"/>
+    <w:link w:val="Titre6"/>
     <w:uiPriority w:val="9"/>
     <w:semiHidden/>
     <w:rsid w:val="00FC693F"/>
@@ -6864,10 +7271,10 @@
       <w:color w:val="243F60" w:themeColor="accent1" w:themeShade="7F"/>
     </w:rPr>
   </w:style>
-  <w:style w:type="character" w:customStyle="1" w:styleId="Heading7Char">
-    <w:name w:val="Heading 7 Char"/>
-    <w:basedOn w:val="DefaultParagraphFont"/>
-    <w:link w:val="Heading7"/>
+  <w:style w:type="character" w:customStyle="1" w:styleId="Titre7Car">
+    <w:name w:val="Titre 7 Car"/>
+    <w:basedOn w:val="Policepardfaut"/>
+    <w:link w:val="Titre7"/>
     <w:uiPriority w:val="9"/>
     <w:semiHidden/>
     <w:rsid w:val="00FC693F"/>
@@ -6878,10 +7285,10 @@
       <w:color w:val="404040" w:themeColor="text1" w:themeTint="BF"/>
     </w:rPr>
   </w:style>
-  <w:style w:type="character" w:customStyle="1" w:styleId="Heading8Char">
-    <w:name w:val="Heading 8 Char"/>
-    <w:basedOn w:val="DefaultParagraphFont"/>
-    <w:link w:val="Heading8"/>
+  <w:style w:type="character" w:customStyle="1" w:styleId="Titre8Car">
+    <w:name w:val="Titre 8 Car"/>
+    <w:basedOn w:val="Policepardfaut"/>
+    <w:link w:val="Titre8"/>
     <w:uiPriority w:val="9"/>
     <w:semiHidden/>
     <w:rsid w:val="00FC693F"/>
@@ -6892,10 +7299,10 @@
       <w:szCs w:val="20"/>
     </w:rPr>
   </w:style>
-  <w:style w:type="character" w:customStyle="1" w:styleId="Heading9Char">
-    <w:name w:val="Heading 9 Char"/>
-    <w:basedOn w:val="DefaultParagraphFont"/>
-    <w:link w:val="Heading9"/>
+  <w:style w:type="character" w:customStyle="1" w:styleId="Titre9Car">
+    <w:name w:val="Titre 9 Car"/>
+    <w:basedOn w:val="Policepardfaut"/>
+    <w:link w:val="Titre9"/>
     <w:uiPriority w:val="9"/>
     <w:semiHidden/>
     <w:rsid w:val="00FC693F"/>
@@ -6908,7 +7315,7 @@
       <w:szCs w:val="20"/>
     </w:rPr>
   </w:style>
-  <w:style w:type="paragraph" w:styleId="Caption">
+  <w:style w:type="paragraph" w:styleId="Lgende">
     <w:name w:val="caption"/>
     <w:basedOn w:val="Normal"/>
     <w:next w:val="Normal"/>
@@ -6928,9 +7335,9 @@
       <w:szCs w:val="18"/>
     </w:rPr>
   </w:style>
-  <w:style w:type="character" w:styleId="Strong">
+  <w:style w:type="character" w:styleId="lev">
     <w:name w:val="Strong"/>
-    <w:basedOn w:val="DefaultParagraphFont"/>
+    <w:basedOn w:val="Policepardfaut"/>
     <w:uiPriority w:val="22"/>
     <w:qFormat/>
     <w:rsid w:val="00FC693F"/>
@@ -6939,9 +7346,9 @@
       <w:bCs/>
     </w:rPr>
   </w:style>
-  <w:style w:type="character" w:styleId="Emphasis">
+  <w:style w:type="character" w:styleId="Accentuation">
     <w:name w:val="Emphasis"/>
-    <w:basedOn w:val="DefaultParagraphFont"/>
+    <w:basedOn w:val="Policepardfaut"/>
     <w:uiPriority w:val="20"/>
     <w:qFormat/>
     <w:rsid w:val="00FC693F"/>
@@ -6950,11 +7357,11 @@
       <w:iCs/>
     </w:rPr>
   </w:style>
-  <w:style w:type="paragraph" w:styleId="IntenseQuote">
+  <w:style w:type="paragraph" w:styleId="Citationintense">
     <w:name w:val="Intense Quote"/>
     <w:basedOn w:val="Normal"/>
     <w:next w:val="Normal"/>
-    <w:link w:val="IntenseQuoteChar"/>
+    <w:link w:val="CitationintenseCar"/>
     <w:uiPriority w:val="30"/>
     <w:qFormat/>
     <w:rsid w:val="00FC693F"/>
@@ -6973,10 +7380,10 @@
       <w:color w:val="4F81BD" w:themeColor="accent1"/>
     </w:rPr>
   </w:style>
-  <w:style w:type="character" w:customStyle="1" w:styleId="IntenseQuoteChar">
-    <w:name w:val="Intense Quote Char"/>
-    <w:basedOn w:val="DefaultParagraphFont"/>
-    <w:link w:val="IntenseQuote"/>
+  <w:style w:type="character" w:customStyle="1" w:styleId="CitationintenseCar">
+    <w:name w:val="Citation intense Car"/>
+    <w:basedOn w:val="Policepardfaut"/>
+    <w:link w:val="Citationintense"/>
     <w:uiPriority w:val="30"/>
     <w:rsid w:val="00FC693F"/>
     <w:rPr>
@@ -6987,9 +7394,9 @@
       <w:color w:val="4F81BD" w:themeColor="accent1"/>
     </w:rPr>
   </w:style>
-  <w:style w:type="character" w:styleId="SubtleEmphasis">
+  <w:style w:type="character" w:styleId="Emphaseple">
     <w:name w:val="Subtle Emphasis"/>
-    <w:basedOn w:val="DefaultParagraphFont"/>
+    <w:basedOn w:val="Policepardfaut"/>
     <w:uiPriority w:val="19"/>
     <w:qFormat/>
     <w:rsid w:val="00FC693F"/>
@@ -6999,9 +7406,9 @@
       <w:color w:val="808080" w:themeColor="text1" w:themeTint="7F"/>
     </w:rPr>
   </w:style>
-  <w:style w:type="character" w:styleId="IntenseEmphasis">
+  <w:style w:type="character" w:styleId="Emphaseintense">
     <w:name w:val="Intense Emphasis"/>
-    <w:basedOn w:val="DefaultParagraphFont"/>
+    <w:basedOn w:val="Policepardfaut"/>
     <w:uiPriority w:val="21"/>
     <w:qFormat/>
     <w:rsid w:val="00FC693F"/>
@@ -7013,9 +7420,9 @@
       <w:color w:val="4F81BD" w:themeColor="accent1"/>
     </w:rPr>
   </w:style>
-  <w:style w:type="character" w:styleId="SubtleReference">
+  <w:style w:type="character" w:styleId="Rfrenceple">
     <w:name w:val="Subtle Reference"/>
-    <w:basedOn w:val="DefaultParagraphFont"/>
+    <w:basedOn w:val="Policepardfaut"/>
     <w:uiPriority w:val="31"/>
     <w:qFormat/>
     <w:rsid w:val="00FC693F"/>
@@ -7025,9 +7432,9 @@
       <w:u w:val="single"/>
     </w:rPr>
   </w:style>
-  <w:style w:type="character" w:styleId="IntenseReference">
+  <w:style w:type="character" w:styleId="Rfrenceintense">
     <w:name w:val="Intense Reference"/>
-    <w:basedOn w:val="DefaultParagraphFont"/>
+    <w:basedOn w:val="Policepardfaut"/>
     <w:uiPriority w:val="32"/>
     <w:qFormat/>
     <w:rsid w:val="00FC693F"/>
@@ -7040,9 +7447,9 @@
       <w:u w:val="single"/>
     </w:rPr>
   </w:style>
-  <w:style w:type="character" w:styleId="BookTitle">
+  <w:style w:type="character" w:styleId="Titredulivre">
     <w:name w:val="Book Title"/>
-    <w:basedOn w:val="DefaultParagraphFont"/>
+    <w:basedOn w:val="Policepardfaut"/>
     <w:uiPriority w:val="33"/>
     <w:qFormat/>
     <w:rsid w:val="00FC693F"/>
@@ -7053,9 +7460,9 @@
       <w:spacing w:val="5"/>
     </w:rPr>
   </w:style>
-  <w:style w:type="paragraph" w:styleId="TOCHeading">
+  <w:style w:type="paragraph" w:styleId="En-ttedetabledesmatires">
     <w:name w:val="TOC Heading"/>
-    <w:basedOn w:val="Heading1"/>
+    <w:basedOn w:val="Titre1"/>
     <w:next w:val="Normal"/>
     <w:uiPriority w:val="39"/>
     <w:semiHidden/>
@@ -7066,9 +7473,9 @@
       <w:outlineLvl w:val="9"/>
     </w:pPr>
   </w:style>
-  <w:style w:type="table" w:styleId="TableGrid">
+  <w:style w:type="table" w:styleId="Grilledutableau">
     <w:name w:val="Table Grid"/>
-    <w:basedOn w:val="TableNormal"/>
+    <w:basedOn w:val="TableauNormal"/>
     <w:uiPriority w:val="59"/>
     <w:rsid w:val="00FC693F"/>
     <w:pPr>
@@ -7085,9 +7492,9 @@
       </w:tblBorders>
     </w:tblPr>
   </w:style>
-  <w:style w:type="table" w:styleId="LightShading">
+  <w:style w:type="table" w:styleId="Ombrageclair">
     <w:name w:val="Light Shading"/>
-    <w:basedOn w:val="TableNormal"/>
+    <w:basedOn w:val="TableauNormal"/>
     <w:uiPriority w:val="60"/>
     <w:rsid w:val="00FC693F"/>
     <w:pPr>
@@ -7181,9 +7588,9 @@
       </w:tcPr>
     </w:tblStylePr>
   </w:style>
-  <w:style w:type="table" w:styleId="LightShading-Accent1">
+  <w:style w:type="table" w:styleId="Trameclaire-Accent1">
     <w:name w:val="Light Shading Accent 1"/>
-    <w:basedOn w:val="TableNormal"/>
+    <w:basedOn w:val="TableauNormal"/>
     <w:uiPriority w:val="60"/>
     <w:rsid w:val="00FC693F"/>
     <w:pPr>
@@ -7277,9 +7684,9 @@
       </w:tcPr>
     </w:tblStylePr>
   </w:style>
-  <w:style w:type="table" w:styleId="LightShading-Accent2">
+  <w:style w:type="table" w:styleId="Trameclaire-Accent2">
     <w:name w:val="Light Shading Accent 2"/>
-    <w:basedOn w:val="TableNormal"/>
+    <w:basedOn w:val="TableauNormal"/>
     <w:uiPriority w:val="60"/>
     <w:rsid w:val="00FC693F"/>
     <w:pPr>
@@ -7373,9 +7780,9 @@
       </w:tcPr>
     </w:tblStylePr>
   </w:style>
-  <w:style w:type="table" w:styleId="LightShading-Accent3">
+  <w:style w:type="table" w:styleId="Trameclaire-Accent3">
     <w:name w:val="Light Shading Accent 3"/>
-    <w:basedOn w:val="TableNormal"/>
+    <w:basedOn w:val="TableauNormal"/>
     <w:uiPriority w:val="60"/>
     <w:rsid w:val="00FC693F"/>
     <w:pPr>
@@ -7469,9 +7876,9 @@
       </w:tcPr>
     </w:tblStylePr>
   </w:style>
-  <w:style w:type="table" w:styleId="LightShading-Accent4">
+  <w:style w:type="table" w:styleId="Trameclaire-Accent4">
     <w:name w:val="Light Shading Accent 4"/>
-    <w:basedOn w:val="TableNormal"/>
+    <w:basedOn w:val="TableauNormal"/>
     <w:uiPriority w:val="60"/>
     <w:rsid w:val="00FC693F"/>
     <w:pPr>
@@ -7565,9 +7972,9 @@
       </w:tcPr>
     </w:tblStylePr>
   </w:style>
-  <w:style w:type="table" w:styleId="LightShading-Accent5">
+  <w:style w:type="table" w:styleId="Trameclaire-Accent5">
     <w:name w:val="Light Shading Accent 5"/>
-    <w:basedOn w:val="TableNormal"/>
+    <w:basedOn w:val="TableauNormal"/>
     <w:uiPriority w:val="60"/>
     <w:rsid w:val="00FC693F"/>
     <w:pPr>
@@ -7661,9 +8068,9 @@
       </w:tcPr>
     </w:tblStylePr>
   </w:style>
-  <w:style w:type="table" w:styleId="LightShading-Accent6">
+  <w:style w:type="table" w:styleId="Trameclaire-Accent6">
     <w:name w:val="Light Shading Accent 6"/>
-    <w:basedOn w:val="TableNormal"/>
+    <w:basedOn w:val="TableauNormal"/>
     <w:uiPriority w:val="60"/>
     <w:rsid w:val="00FC693F"/>
     <w:pPr>
@@ -7757,9 +8164,9 @@
       </w:tcPr>
     </w:tblStylePr>
   </w:style>
-  <w:style w:type="table" w:styleId="LightList">
+  <w:style w:type="table" w:styleId="Listeclaire">
     <w:name w:val="Light List"/>
-    <w:basedOn w:val="TableNormal"/>
+    <w:basedOn w:val="TableauNormal"/>
     <w:uiPriority w:val="61"/>
     <w:rsid w:val="00FC693F"/>
     <w:pPr>
@@ -7842,9 +8249,9 @@
       </w:tcPr>
     </w:tblStylePr>
   </w:style>
-  <w:style w:type="table" w:styleId="LightList-Accent1">
+  <w:style w:type="table" w:styleId="Listeclaire-Accent1">
     <w:name w:val="Light List Accent 1"/>
-    <w:basedOn w:val="TableNormal"/>
+    <w:basedOn w:val="TableauNormal"/>
     <w:uiPriority w:val="61"/>
     <w:rsid w:val="00FC693F"/>
     <w:pPr>
@@ -7927,9 +8334,9 @@
       </w:tcPr>
     </w:tblStylePr>
   </w:style>
-  <w:style w:type="table" w:styleId="LightList-Accent2">
+  <w:style w:type="table" w:styleId="Listeclaire-Accent2">
     <w:name w:val="Light List Accent 2"/>
-    <w:basedOn w:val="TableNormal"/>
+    <w:basedOn w:val="TableauNormal"/>
     <w:uiPriority w:val="61"/>
     <w:rsid w:val="00CB0664"/>
     <w:pPr>
@@ -8012,9 +8419,9 @@
       </w:tcPr>
     </w:tblStylePr>
   </w:style>
-  <w:style w:type="table" w:styleId="LightList-Accent3">
+  <w:style w:type="table" w:styleId="Listeclaire-Accent3">
     <w:name w:val="Light List Accent 3"/>
-    <w:basedOn w:val="TableNormal"/>
+    <w:basedOn w:val="TableauNormal"/>
     <w:uiPriority w:val="61"/>
     <w:rsid w:val="00CB0664"/>
     <w:pPr>
@@ -8097,9 +8504,9 @@
       </w:tcPr>
     </w:tblStylePr>
   </w:style>
-  <w:style w:type="table" w:styleId="LightList-Accent4">
+  <w:style w:type="table" w:styleId="Listeclaire-Accent4">
     <w:name w:val="Light List Accent 4"/>
-    <w:basedOn w:val="TableNormal"/>
+    <w:basedOn w:val="TableauNormal"/>
     <w:uiPriority w:val="61"/>
     <w:rsid w:val="00CB0664"/>
     <w:pPr>
@@ -8182,9 +8589,9 @@
       </w:tcPr>
     </w:tblStylePr>
   </w:style>
-  <w:style w:type="table" w:styleId="LightList-Accent5">
+  <w:style w:type="table" w:styleId="Listeclaire-Accent5">
     <w:name w:val="Light List Accent 5"/>
-    <w:basedOn w:val="TableNormal"/>
+    <w:basedOn w:val="TableauNormal"/>
     <w:uiPriority w:val="61"/>
     <w:rsid w:val="00CB0664"/>
     <w:pPr>
@@ -8267,9 +8674,9 @@
       </w:tcPr>
     </w:tblStylePr>
   </w:style>
-  <w:style w:type="table" w:styleId="LightList-Accent6">
+  <w:style w:type="table" w:styleId="Listeclaire-Accent6">
     <w:name w:val="Light List Accent 6"/>
-    <w:basedOn w:val="TableNormal"/>
+    <w:basedOn w:val="TableauNormal"/>
     <w:uiPriority w:val="61"/>
     <w:rsid w:val="00CB0664"/>
     <w:pPr>
@@ -8352,9 +8759,9 @@
       </w:tcPr>
     </w:tblStylePr>
   </w:style>
-  <w:style w:type="table" w:styleId="LightGrid">
+  <w:style w:type="table" w:styleId="Grilleclaire">
     <w:name w:val="Light Grid"/>
-    <w:basedOn w:val="TableNormal"/>
+    <w:basedOn w:val="TableauNormal"/>
     <w:uiPriority w:val="62"/>
     <w:rsid w:val="00CB0664"/>
     <w:pPr>
@@ -8475,9 +8882,9 @@
       </w:tcPr>
     </w:tblStylePr>
   </w:style>
-  <w:style w:type="table" w:styleId="LightGrid-Accent1">
+  <w:style w:type="table" w:styleId="Grilleclaire-Accent1">
     <w:name w:val="Light Grid Accent 1"/>
-    <w:basedOn w:val="TableNormal"/>
+    <w:basedOn w:val="TableauNormal"/>
     <w:uiPriority w:val="62"/>
     <w:rsid w:val="00CB0664"/>
     <w:pPr>
@@ -8598,9 +9005,9 @@
       </w:tcPr>
     </w:tblStylePr>
   </w:style>
-  <w:style w:type="table" w:styleId="LightGrid-Accent2">
+  <w:style w:type="table" w:styleId="Grilleclaire-Accent2">
     <w:name w:val="Light Grid Accent 2"/>
-    <w:basedOn w:val="TableNormal"/>
+    <w:basedOn w:val="TableauNormal"/>
     <w:uiPriority w:val="62"/>
     <w:rsid w:val="00CB0664"/>
     <w:pPr>
@@ -8721,9 +9128,9 @@
       </w:tcPr>
     </w:tblStylePr>
   </w:style>
-  <w:style w:type="table" w:styleId="LightGrid-Accent3">
+  <w:style w:type="table" w:styleId="Grilleclaire-Accent3">
     <w:name w:val="Light Grid Accent 3"/>
-    <w:basedOn w:val="TableNormal"/>
+    <w:basedOn w:val="TableauNormal"/>
     <w:uiPriority w:val="62"/>
     <w:rsid w:val="00CB0664"/>
     <w:pPr>
@@ -8844,9 +9251,9 @@
       </w:tcPr>
     </w:tblStylePr>
   </w:style>
-  <w:style w:type="table" w:styleId="LightGrid-Accent4">
+  <w:style w:type="table" w:styleId="Grilleclaire-Accent4">
     <w:name w:val="Light Grid Accent 4"/>
-    <w:basedOn w:val="TableNormal"/>
+    <w:basedOn w:val="TableauNormal"/>
     <w:uiPriority w:val="62"/>
     <w:rsid w:val="00CB0664"/>
     <w:pPr>
@@ -8967,9 +9374,9 @@
       </w:tcPr>
     </w:tblStylePr>
   </w:style>
-  <w:style w:type="table" w:styleId="LightGrid-Accent5">
+  <w:style w:type="table" w:styleId="Grilleclaire-Accent5">
     <w:name w:val="Light Grid Accent 5"/>
-    <w:basedOn w:val="TableNormal"/>
+    <w:basedOn w:val="TableauNormal"/>
     <w:uiPriority w:val="62"/>
     <w:rsid w:val="00CB0664"/>
     <w:pPr>
@@ -9090,9 +9497,9 @@
       </w:tcPr>
     </w:tblStylePr>
   </w:style>
-  <w:style w:type="table" w:styleId="LightGrid-Accent6">
+  <w:style w:type="table" w:styleId="Grilleclaire-Accent6">
     <w:name w:val="Light Grid Accent 6"/>
-    <w:basedOn w:val="TableNormal"/>
+    <w:basedOn w:val="TableauNormal"/>
     <w:uiPriority w:val="62"/>
     <w:rsid w:val="00CB0664"/>
     <w:pPr>
@@ -9213,9 +9620,9 @@
       </w:tcPr>
     </w:tblStylePr>
   </w:style>
-  <w:style w:type="table" w:styleId="MediumShading1">
+  <w:style w:type="table" w:styleId="Tramemoyenne1">
     <w:name w:val="Medium Shading 1"/>
-    <w:basedOn w:val="TableNormal"/>
+    <w:basedOn w:val="TableauNormal"/>
     <w:uiPriority w:val="63"/>
     <w:rsid w:val="00CB0664"/>
     <w:pPr>
@@ -9312,9 +9719,9 @@
       </w:tcPr>
     </w:tblStylePr>
   </w:style>
-  <w:style w:type="table" w:styleId="MediumShading1-Accent1">
+  <w:style w:type="table" w:styleId="Tramemoyenne1-Accent1">
     <w:name w:val="Medium Shading 1 Accent 1"/>
-    <w:basedOn w:val="TableNormal"/>
+    <w:basedOn w:val="TableauNormal"/>
     <w:uiPriority w:val="63"/>
     <w:rsid w:val="00CB0664"/>
     <w:pPr>
@@ -9411,9 +9818,9 @@
       </w:tcPr>
     </w:tblStylePr>
   </w:style>
-  <w:style w:type="table" w:styleId="MediumShading1-Accent2">
+  <w:style w:type="table" w:styleId="Tramemoyenne1-Accent2">
     <w:name w:val="Medium Shading 1 Accent 2"/>
-    <w:basedOn w:val="TableNormal"/>
+    <w:basedOn w:val="TableauNormal"/>
     <w:uiPriority w:val="63"/>
     <w:rsid w:val="00CB0664"/>
     <w:pPr>
@@ -9510,9 +9917,9 @@
       </w:tcPr>
     </w:tblStylePr>
   </w:style>
-  <w:style w:type="table" w:styleId="MediumShading1-Accent3">
+  <w:style w:type="table" w:styleId="Tramemoyenne1-Accent3">
     <w:name w:val="Medium Shading 1 Accent 3"/>
-    <w:basedOn w:val="TableNormal"/>
+    <w:basedOn w:val="TableauNormal"/>
     <w:uiPriority w:val="63"/>
     <w:rsid w:val="00CB0664"/>
     <w:pPr>
@@ -9609,9 +10016,9 @@
       </w:tcPr>
     </w:tblStylePr>
   </w:style>
-  <w:style w:type="table" w:styleId="MediumShading1-Accent4">
+  <w:style w:type="table" w:styleId="Tramemoyenne1-Accent4">
     <w:name w:val="Medium Shading 1 Accent 4"/>
-    <w:basedOn w:val="TableNormal"/>
+    <w:basedOn w:val="TableauNormal"/>
     <w:uiPriority w:val="63"/>
     <w:rsid w:val="00CB0664"/>
     <w:pPr>
@@ -9708,9 +10115,9 @@
       </w:tcPr>
     </w:tblStylePr>
   </w:style>
-  <w:style w:type="table" w:styleId="MediumShading1-Accent5">
+  <w:style w:type="table" w:styleId="Tramemoyenne1-Accent5">
     <w:name w:val="Medium Shading 1 Accent 5"/>
-    <w:basedOn w:val="TableNormal"/>
+    <w:basedOn w:val="TableauNormal"/>
     <w:uiPriority w:val="63"/>
     <w:rsid w:val="00CB0664"/>
     <w:pPr>
@@ -9807,9 +10214,9 @@
       </w:tcPr>
     </w:tblStylePr>
   </w:style>
-  <w:style w:type="table" w:styleId="MediumShading1-Accent6">
+  <w:style w:type="table" w:styleId="Tramemoyenne1-Accent6">
     <w:name w:val="Medium Shading 1 Accent 6"/>
-    <w:basedOn w:val="TableNormal"/>
+    <w:basedOn w:val="TableauNormal"/>
     <w:uiPriority w:val="63"/>
     <w:rsid w:val="00CB0664"/>
     <w:pPr>
@@ -9906,9 +10313,9 @@
       </w:tcPr>
     </w:tblStylePr>
   </w:style>
-  <w:style w:type="table" w:styleId="MediumShading2">
+  <w:style w:type="table" w:styleId="Tramemoyenne2">
     <w:name w:val="Medium Shading 2"/>
-    <w:basedOn w:val="TableNormal"/>
+    <w:basedOn w:val="TableauNormal"/>
     <w:uiPriority w:val="64"/>
     <w:rsid w:val="00CB0664"/>
     <w:pPr>
@@ -10048,9 +10455,9 @@
       </w:tcPr>
     </w:tblStylePr>
   </w:style>
-  <w:style w:type="table" w:styleId="MediumShading2-Accent1">
+  <w:style w:type="table" w:styleId="Tramemoyenne2-Accent1">
     <w:name w:val="Medium Shading 2 Accent 1"/>
-    <w:basedOn w:val="TableNormal"/>
+    <w:basedOn w:val="TableauNormal"/>
     <w:uiPriority w:val="64"/>
     <w:rsid w:val="00CB0664"/>
     <w:pPr>
@@ -10190,9 +10597,9 @@
       </w:tcPr>
     </w:tblStylePr>
   </w:style>
-  <w:style w:type="table" w:styleId="MediumShading2-Accent2">
+  <w:style w:type="table" w:styleId="Tramemoyenne2-Accent2">
     <w:name w:val="Medium Shading 2 Accent 2"/>
-    <w:basedOn w:val="TableNormal"/>
+    <w:basedOn w:val="TableauNormal"/>
     <w:uiPriority w:val="64"/>
     <w:rsid w:val="00CB0664"/>
     <w:pPr>
@@ -10332,9 +10739,9 @@
       </w:tcPr>
     </w:tblStylePr>
   </w:style>
-  <w:style w:type="table" w:styleId="MediumShading2-Accent3">
+  <w:style w:type="table" w:styleId="Tramemoyenne2-Accent3">
     <w:name w:val="Medium Shading 2 Accent 3"/>
-    <w:basedOn w:val="TableNormal"/>
+    <w:basedOn w:val="TableauNormal"/>
     <w:uiPriority w:val="64"/>
     <w:rsid w:val="00CB0664"/>
     <w:pPr>
@@ -10474,9 +10881,9 @@
       </w:tcPr>
     </w:tblStylePr>
   </w:style>
-  <w:style w:type="table" w:styleId="MediumShading2-Accent4">
+  <w:style w:type="table" w:styleId="Tramemoyenne2-Accent4">
     <w:name w:val="Medium Shading 2 Accent 4"/>
-    <w:basedOn w:val="TableNormal"/>
+    <w:basedOn w:val="TableauNormal"/>
     <w:uiPriority w:val="64"/>
     <w:rsid w:val="00CB0664"/>
     <w:pPr>
@@ -10616,9 +11023,9 @@
       </w:tcPr>
     </w:tblStylePr>
   </w:style>
-  <w:style w:type="table" w:styleId="MediumShading2-Accent5">
+  <w:style w:type="table" w:styleId="Tramemoyenne2-Accent5">
     <w:name w:val="Medium Shading 2 Accent 5"/>
-    <w:basedOn w:val="TableNormal"/>
+    <w:basedOn w:val="TableauNormal"/>
     <w:uiPriority w:val="64"/>
     <w:rsid w:val="00CB0664"/>
     <w:pPr>
@@ -10758,9 +11165,9 @@
       </w:tcPr>
     </w:tblStylePr>
   </w:style>
-  <w:style w:type="table" w:styleId="MediumShading2-Accent6">
+  <w:style w:type="table" w:styleId="Tramemoyenne2-Accent6">
     <w:name w:val="Medium Shading 2 Accent 6"/>
-    <w:basedOn w:val="TableNormal"/>
+    <w:basedOn w:val="TableauNormal"/>
     <w:uiPriority w:val="64"/>
     <w:rsid w:val="00CB0664"/>
     <w:pPr>
@@ -10900,9 +11307,9 @@
       </w:tcPr>
     </w:tblStylePr>
   </w:style>
-  <w:style w:type="table" w:styleId="MediumList1">
+  <w:style w:type="table" w:styleId="Listemoyenne1">
     <w:name w:val="Medium List 1"/>
-    <w:basedOn w:val="TableNormal"/>
+    <w:basedOn w:val="TableauNormal"/>
     <w:uiPriority w:val="65"/>
     <w:rsid w:val="00CB0664"/>
     <w:pPr>
@@ -10977,9 +11384,9 @@
       </w:tcPr>
     </w:tblStylePr>
   </w:style>
-  <w:style w:type="table" w:styleId="MediumList1-Accent1">
+  <w:style w:type="table" w:styleId="Listemoyenne1-Accent1">
     <w:name w:val="Medium List 1 Accent 1"/>
-    <w:basedOn w:val="TableNormal"/>
+    <w:basedOn w:val="TableauNormal"/>
     <w:uiPriority w:val="65"/>
     <w:rsid w:val="00CB0664"/>
     <w:pPr>
@@ -11054,9 +11461,9 @@
       </w:tcPr>
     </w:tblStylePr>
   </w:style>
-  <w:style w:type="table" w:styleId="MediumList1-Accent2">
+  <w:style w:type="table" w:styleId="Listemoyenne1-Accent2">
     <w:name w:val="Medium List 1 Accent 2"/>
-    <w:basedOn w:val="TableNormal"/>
+    <w:basedOn w:val="TableauNormal"/>
     <w:uiPriority w:val="65"/>
     <w:rsid w:val="00CB0664"/>
     <w:pPr>
@@ -11131,9 +11538,9 @@
       </w:tcPr>
     </w:tblStylePr>
   </w:style>
-  <w:style w:type="table" w:styleId="MediumList1-Accent3">
+  <w:style w:type="table" w:styleId="Listemoyenne1-Accent3">
     <w:name w:val="Medium List 1 Accent 3"/>
-    <w:basedOn w:val="TableNormal"/>
+    <w:basedOn w:val="TableauNormal"/>
     <w:uiPriority w:val="65"/>
     <w:rsid w:val="00CB0664"/>
     <w:pPr>
@@ -11208,9 +11615,9 @@
       </w:tcPr>
     </w:tblStylePr>
   </w:style>
-  <w:style w:type="table" w:styleId="MediumList1-Accent4">
+  <w:style w:type="table" w:styleId="Listemoyenne1-Accent4">
     <w:name w:val="Medium List 1 Accent 4"/>
-    <w:basedOn w:val="TableNormal"/>
+    <w:basedOn w:val="TableauNormal"/>
     <w:uiPriority w:val="65"/>
     <w:rsid w:val="00CB0664"/>
     <w:pPr>
@@ -11285,9 +11692,9 @@
       </w:tcPr>
     </w:tblStylePr>
   </w:style>
-  <w:style w:type="table" w:styleId="MediumList1-Accent5">
+  <w:style w:type="table" w:styleId="Listemoyenne1-Accent5">
     <w:name w:val="Medium List 1 Accent 5"/>
-    <w:basedOn w:val="TableNormal"/>
+    <w:basedOn w:val="TableauNormal"/>
     <w:uiPriority w:val="65"/>
     <w:rsid w:val="00CB0664"/>
     <w:pPr>
@@ -11362,9 +11769,9 @@
       </w:tcPr>
     </w:tblStylePr>
   </w:style>
-  <w:style w:type="table" w:styleId="MediumList1-Accent6">
+  <w:style w:type="table" w:styleId="Listemoyenne1-Accent6">
     <w:name w:val="Medium List 1 Accent 6"/>
-    <w:basedOn w:val="TableNormal"/>
+    <w:basedOn w:val="TableauNormal"/>
     <w:uiPriority w:val="65"/>
     <w:rsid w:val="00CB0664"/>
     <w:pPr>
@@ -11439,9 +11846,9 @@
       </w:tcPr>
     </w:tblStylePr>
   </w:style>
-  <w:style w:type="table" w:styleId="MediumList2">
+  <w:style w:type="table" w:styleId="Listemoyenne2">
     <w:name w:val="Medium List 2"/>
-    <w:basedOn w:val="TableNormal"/>
+    <w:basedOn w:val="TableauNormal"/>
     <w:uiPriority w:val="66"/>
     <w:rsid w:val="00CB0664"/>
     <w:pPr>
@@ -11560,9 +11967,9 @@
       </w:tcPr>
     </w:tblStylePr>
   </w:style>
-  <w:style w:type="table" w:styleId="MediumList2-Accent1">
+  <w:style w:type="table" w:styleId="Listemoyenne2-Accent1">
     <w:name w:val="Medium List 2 Accent 1"/>
-    <w:basedOn w:val="TableNormal"/>
+    <w:basedOn w:val="TableauNormal"/>
     <w:uiPriority w:val="66"/>
     <w:rsid w:val="00CB0664"/>
     <w:pPr>
@@ -11681,9 +12088,9 @@
       </w:tcPr>
     </w:tblStylePr>
   </w:style>
-  <w:style w:type="table" w:styleId="MediumList2-Accent2">
+  <w:style w:type="table" w:styleId="Listemoyenne2-Accent2">
     <w:name w:val="Medium List 2 Accent 2"/>
-    <w:basedOn w:val="TableNormal"/>
+    <w:basedOn w:val="TableauNormal"/>
     <w:uiPriority w:val="66"/>
     <w:rsid w:val="00CB0664"/>
     <w:pPr>
@@ -11802,9 +12209,9 @@
       </w:tcPr>
     </w:tblStylePr>
   </w:style>
-  <w:style w:type="table" w:styleId="MediumList2-Accent3">
+  <w:style w:type="table" w:styleId="Listemoyenne2-Accent3">
     <w:name w:val="Medium List 2 Accent 3"/>
-    <w:basedOn w:val="TableNormal"/>
+    <w:basedOn w:val="TableauNormal"/>
     <w:uiPriority w:val="66"/>
     <w:rsid w:val="00CB0664"/>
     <w:pPr>
@@ -11923,9 +12330,9 @@
       </w:tcPr>
     </w:tblStylePr>
   </w:style>
-  <w:style w:type="table" w:styleId="MediumList2-Accent4">
+  <w:style w:type="table" w:styleId="Listemoyenne2-Accent4">
     <w:name w:val="Medium List 2 Accent 4"/>
-    <w:basedOn w:val="TableNormal"/>
+    <w:basedOn w:val="TableauNormal"/>
     <w:uiPriority w:val="66"/>
     <w:rsid w:val="00CB0664"/>
     <w:pPr>
@@ -12044,9 +12451,9 @@
       </w:tcPr>
     </w:tblStylePr>
   </w:style>
-  <w:style w:type="table" w:styleId="MediumList2-Accent5">
+  <w:style w:type="table" w:styleId="Listemoyenne2-Accent5">
     <w:name w:val="Medium List 2 Accent 5"/>
-    <w:basedOn w:val="TableNormal"/>
+    <w:basedOn w:val="TableauNormal"/>
     <w:uiPriority w:val="66"/>
     <w:rsid w:val="00CB0664"/>
     <w:pPr>
@@ -12165,9 +12572,9 @@
       </w:tcPr>
     </w:tblStylePr>
   </w:style>
-  <w:style w:type="table" w:styleId="MediumList2-Accent6">
+  <w:style w:type="table" w:styleId="Listemoyenne2-Accent6">
     <w:name w:val="Medium List 2 Accent 6"/>
-    <w:basedOn w:val="TableNormal"/>
+    <w:basedOn w:val="TableauNormal"/>
     <w:uiPriority w:val="66"/>
     <w:rsid w:val="00CB0664"/>
     <w:pPr>
@@ -12286,9 +12693,9 @@
       </w:tcPr>
     </w:tblStylePr>
   </w:style>
-  <w:style w:type="table" w:styleId="MediumGrid1">
+  <w:style w:type="table" w:styleId="Grillemoyenne1">
     <w:name w:val="Medium Grid 1"/>
-    <w:basedOn w:val="TableNormal"/>
+    <w:basedOn w:val="TableauNormal"/>
     <w:uiPriority w:val="67"/>
     <w:rsid w:val="00CB0664"/>
     <w:pPr>
@@ -12352,9 +12759,9 @@
       </w:tcPr>
     </w:tblStylePr>
   </w:style>
-  <w:style w:type="table" w:styleId="MediumGrid1-Accent1">
+  <w:style w:type="table" w:styleId="Grillemoyenne1-Accent1">
     <w:name w:val="Medium Grid 1 Accent 1"/>
-    <w:basedOn w:val="TableNormal"/>
+    <w:basedOn w:val="TableauNormal"/>
     <w:uiPriority w:val="67"/>
     <w:rsid w:val="00CB0664"/>
     <w:pPr>
@@ -12418,9 +12825,9 @@
       </w:tcPr>
     </w:tblStylePr>
   </w:style>
-  <w:style w:type="table" w:styleId="MediumGrid1-Accent2">
+  <w:style w:type="table" w:styleId="Grillemoyenne1-Accent2">
     <w:name w:val="Medium Grid 1 Accent 2"/>
-    <w:basedOn w:val="TableNormal"/>
+    <w:basedOn w:val="TableauNormal"/>
     <w:uiPriority w:val="67"/>
     <w:rsid w:val="00CB0664"/>
     <w:pPr>
@@ -12484,9 +12891,9 @@
       </w:tcPr>
     </w:tblStylePr>
   </w:style>
-  <w:style w:type="table" w:styleId="MediumGrid1-Accent3">
+  <w:style w:type="table" w:styleId="Grillemoyenne1-Accent3">
     <w:name w:val="Medium Grid 1 Accent 3"/>
-    <w:basedOn w:val="TableNormal"/>
+    <w:basedOn w:val="TableauNormal"/>
     <w:uiPriority w:val="67"/>
     <w:rsid w:val="00CB0664"/>
     <w:pPr>
@@ -12550,9 +12957,9 @@
       </w:tcPr>
     </w:tblStylePr>
   </w:style>
-  <w:style w:type="table" w:styleId="MediumGrid1-Accent4">
+  <w:style w:type="table" w:styleId="Grillemoyenne1-Accent4">
     <w:name w:val="Medium Grid 1 Accent 4"/>
-    <w:basedOn w:val="TableNormal"/>
+    <w:basedOn w:val="TableauNormal"/>
     <w:uiPriority w:val="67"/>
     <w:rsid w:val="00CB0664"/>
     <w:pPr>
@@ -12616,9 +13023,9 @@
       </w:tcPr>
     </w:tblStylePr>
   </w:style>
-  <w:style w:type="table" w:styleId="MediumGrid1-Accent5">
+  <w:style w:type="table" w:styleId="Grillemoyenne1-Accent5">
     <w:name w:val="Medium Grid 1 Accent 5"/>
-    <w:basedOn w:val="TableNormal"/>
+    <w:basedOn w:val="TableauNormal"/>
     <w:uiPriority w:val="67"/>
     <w:rsid w:val="00CB0664"/>
     <w:pPr>
@@ -12682,9 +13089,9 @@
       </w:tcPr>
     </w:tblStylePr>
   </w:style>
-  <w:style w:type="table" w:styleId="MediumGrid1-Accent6">
+  <w:style w:type="table" w:styleId="Grillemoyenne1-Accent6">
     <w:name w:val="Medium Grid 1 Accent 6"/>
-    <w:basedOn w:val="TableNormal"/>
+    <w:basedOn w:val="TableauNormal"/>
     <w:uiPriority w:val="67"/>
     <w:rsid w:val="00CB0664"/>
     <w:pPr>
@@ -12748,9 +13155,9 @@
       </w:tcPr>
     </w:tblStylePr>
   </w:style>
-  <w:style w:type="table" w:styleId="MediumGrid2">
+  <w:style w:type="table" w:styleId="Grillemoyenne2">
     <w:name w:val="Medium Grid 2"/>
-    <w:basedOn w:val="TableNormal"/>
+    <w:basedOn w:val="TableauNormal"/>
     <w:uiPriority w:val="68"/>
     <w:rsid w:val="00CB0664"/>
     <w:pPr>
@@ -12866,9 +13273,9 @@
       </w:tcPr>
     </w:tblStylePr>
   </w:style>
-  <w:style w:type="table" w:styleId="MediumGrid2-Accent1">
+  <w:style w:type="table" w:styleId="Grillemoyenne2-Accent1">
     <w:name w:val="Medium Grid 2 Accent 1"/>
-    <w:basedOn w:val="TableNormal"/>
+    <w:basedOn w:val="TableauNormal"/>
     <w:uiPriority w:val="68"/>
     <w:rsid w:val="00CB0664"/>
     <w:pPr>
@@ -12984,9 +13391,9 @@
       </w:tcPr>
     </w:tblStylePr>
   </w:style>
-  <w:style w:type="table" w:styleId="MediumGrid2-Accent2">
+  <w:style w:type="table" w:styleId="Grillemoyenne2-Accent2">
     <w:name w:val="Medium Grid 2 Accent 2"/>
-    <w:basedOn w:val="TableNormal"/>
+    <w:basedOn w:val="TableauNormal"/>
     <w:uiPriority w:val="68"/>
     <w:rsid w:val="00CB0664"/>
     <w:pPr>
@@ -13102,9 +13509,9 @@
       </w:tcPr>
     </w:tblStylePr>
   </w:style>
-  <w:style w:type="table" w:styleId="MediumGrid2-Accent3">
+  <w:style w:type="table" w:styleId="Grillemoyenne2-Accent3">
     <w:name w:val="Medium Grid 2 Accent 3"/>
-    <w:basedOn w:val="TableNormal"/>
+    <w:basedOn w:val="TableauNormal"/>
     <w:uiPriority w:val="68"/>
     <w:rsid w:val="00CB0664"/>
     <w:pPr>
@@ -13220,9 +13627,9 @@
       </w:tcPr>
     </w:tblStylePr>
   </w:style>
-  <w:style w:type="table" w:styleId="MediumGrid2-Accent4">
+  <w:style w:type="table" w:styleId="Grillemoyenne2-Accent4">
     <w:name w:val="Medium Grid 2 Accent 4"/>
-    <w:basedOn w:val="TableNormal"/>
+    <w:basedOn w:val="TableauNormal"/>
     <w:uiPriority w:val="68"/>
     <w:rsid w:val="00CB0664"/>
     <w:pPr>
@@ -13338,9 +13745,9 @@
       </w:tcPr>
     </w:tblStylePr>
   </w:style>
-  <w:style w:type="table" w:styleId="MediumGrid2-Accent5">
+  <w:style w:type="table" w:styleId="Grillemoyenne2-Accent5">
     <w:name w:val="Medium Grid 2 Accent 5"/>
-    <w:basedOn w:val="TableNormal"/>
+    <w:basedOn w:val="TableauNormal"/>
     <w:uiPriority w:val="68"/>
     <w:rsid w:val="00CB0664"/>
     <w:pPr>
@@ -13456,9 +13863,9 @@
       </w:tcPr>
     </w:tblStylePr>
   </w:style>
-  <w:style w:type="table" w:styleId="MediumGrid2-Accent6">
+  <w:style w:type="table" w:styleId="Grillemoyenne2-Accent6">
     <w:name w:val="Medium Grid 2 Accent 6"/>
-    <w:basedOn w:val="TableNormal"/>
+    <w:basedOn w:val="TableauNormal"/>
     <w:uiPriority w:val="68"/>
     <w:rsid w:val="00CB0664"/>
     <w:pPr>
@@ -13574,9 +13981,9 @@
       </w:tcPr>
     </w:tblStylePr>
   </w:style>
-  <w:style w:type="table" w:styleId="MediumGrid3">
+  <w:style w:type="table" w:styleId="Grillemoyenne3">
     <w:name w:val="Medium Grid 3"/>
-    <w:basedOn w:val="TableNormal"/>
+    <w:basedOn w:val="TableauNormal"/>
     <w:uiPriority w:val="69"/>
     <w:rsid w:val="00CB0664"/>
     <w:pPr>
@@ -13708,9 +14115,9 @@
       </w:tcPr>
     </w:tblStylePr>
   </w:style>
-  <w:style w:type="table" w:styleId="MediumGrid3-Accent1">
+  <w:style w:type="table" w:styleId="Grillemoyenne3-Accent1">
     <w:name w:val="Medium Grid 3 Accent 1"/>
-    <w:basedOn w:val="TableNormal"/>
+    <w:basedOn w:val="TableauNormal"/>
     <w:uiPriority w:val="69"/>
     <w:rsid w:val="00CB0664"/>
     <w:pPr>
@@ -13842,9 +14249,9 @@
       </w:tcPr>
     </w:tblStylePr>
   </w:style>
-  <w:style w:type="table" w:styleId="MediumGrid3-Accent2">
+  <w:style w:type="table" w:styleId="Grillemoyenne3-Accent2">
     <w:name w:val="Medium Grid 3 Accent 2"/>
-    <w:basedOn w:val="TableNormal"/>
+    <w:basedOn w:val="TableauNormal"/>
     <w:uiPriority w:val="69"/>
     <w:rsid w:val="00CB0664"/>
     <w:pPr>
@@ -13976,9 +14383,9 @@
       </w:tcPr>
     </w:tblStylePr>
   </w:style>
-  <w:style w:type="table" w:styleId="MediumGrid3-Accent3">
+  <w:style w:type="table" w:styleId="Grillemoyenne3-Accent3">
     <w:name w:val="Medium Grid 3 Accent 3"/>
-    <w:basedOn w:val="TableNormal"/>
+    <w:basedOn w:val="TableauNormal"/>
     <w:uiPriority w:val="69"/>
     <w:rsid w:val="00CB0664"/>
     <w:pPr>
@@ -14110,9 +14517,9 @@
       </w:tcPr>
     </w:tblStylePr>
   </w:style>
-  <w:style w:type="table" w:styleId="MediumGrid3-Accent4">
+  <w:style w:type="table" w:styleId="Grillemoyenne3-Accent4">
     <w:name w:val="Medium Grid 3 Accent 4"/>
-    <w:basedOn w:val="TableNormal"/>
+    <w:basedOn w:val="TableauNormal"/>
     <w:uiPriority w:val="69"/>
     <w:rsid w:val="00CB0664"/>
     <w:pPr>
@@ -14244,9 +14651,9 @@
       </w:tcPr>
     </w:tblStylePr>
   </w:style>
-  <w:style w:type="table" w:styleId="MediumGrid3-Accent5">
+  <w:style w:type="table" w:styleId="Grillemoyenne3-Accent5">
     <w:name w:val="Medium Grid 3 Accent 5"/>
-    <w:basedOn w:val="TableNormal"/>
+    <w:basedOn w:val="TableauNormal"/>
     <w:uiPriority w:val="69"/>
     <w:rsid w:val="00CB0664"/>
     <w:pPr>
@@ -14378,9 +14785,9 @@
       </w:tcPr>
     </w:tblStylePr>
   </w:style>
-  <w:style w:type="table" w:styleId="MediumGrid3-Accent6">
+  <w:style w:type="table" w:styleId="Grillemoyenne3-Accent6">
     <w:name w:val="Medium Grid 3 Accent 6"/>
-    <w:basedOn w:val="TableNormal"/>
+    <w:basedOn w:val="TableauNormal"/>
     <w:uiPriority w:val="69"/>
     <w:rsid w:val="00CB0664"/>
     <w:pPr>
@@ -14512,9 +14919,9 @@
       </w:tcPr>
     </w:tblStylePr>
   </w:style>
-  <w:style w:type="table" w:styleId="DarkList">
+  <w:style w:type="table" w:styleId="Listefonce">
     <w:name w:val="Dark List"/>
-    <w:basedOn w:val="TableNormal"/>
+    <w:basedOn w:val="TableauNormal"/>
     <w:uiPriority w:val="70"/>
     <w:rsid w:val="00CB0664"/>
     <w:pPr>
@@ -14619,9 +15026,9 @@
       </w:tcPr>
     </w:tblStylePr>
   </w:style>
-  <w:style w:type="table" w:styleId="DarkList-Accent1">
+  <w:style w:type="table" w:styleId="Listefonce-Accent1">
     <w:name w:val="Dark List Accent 1"/>
-    <w:basedOn w:val="TableNormal"/>
+    <w:basedOn w:val="TableauNormal"/>
     <w:uiPriority w:val="70"/>
     <w:rsid w:val="00CB0664"/>
     <w:pPr>
@@ -14726,9 +15133,9 @@
       </w:tcPr>
     </w:tblStylePr>
   </w:style>
-  <w:style w:type="table" w:styleId="DarkList-Accent2">
+  <w:style w:type="table" w:styleId="Listefonce-Accent2">
     <w:name w:val="Dark List Accent 2"/>
-    <w:basedOn w:val="TableNormal"/>
+    <w:basedOn w:val="TableauNormal"/>
     <w:uiPriority w:val="70"/>
     <w:rsid w:val="00CB0664"/>
     <w:pPr>
@@ -14833,9 +15240,9 @@
       </w:tcPr>
     </w:tblStylePr>
   </w:style>
-  <w:style w:type="table" w:styleId="DarkList-Accent3">
+  <w:style w:type="table" w:styleId="Listefonce-Accent3">
     <w:name w:val="Dark List Accent 3"/>
-    <w:basedOn w:val="TableNormal"/>
+    <w:basedOn w:val="TableauNormal"/>
     <w:uiPriority w:val="70"/>
     <w:rsid w:val="00CB0664"/>
     <w:pPr>
@@ -14940,9 +15347,9 @@
       </w:tcPr>
     </w:tblStylePr>
   </w:style>
-  <w:style w:type="table" w:styleId="DarkList-Accent4">
+  <w:style w:type="table" w:styleId="Listefonce-Accent4">
     <w:name w:val="Dark List Accent 4"/>
-    <w:basedOn w:val="TableNormal"/>
+    <w:basedOn w:val="TableauNormal"/>
     <w:uiPriority w:val="70"/>
     <w:rsid w:val="00CB0664"/>
     <w:pPr>
@@ -15047,9 +15454,9 @@
       </w:tcPr>
     </w:tblStylePr>
   </w:style>
-  <w:style w:type="table" w:styleId="DarkList-Accent5">
+  <w:style w:type="table" w:styleId="Listefonce-Accent5">
     <w:name w:val="Dark List Accent 5"/>
-    <w:basedOn w:val="TableNormal"/>
+    <w:basedOn w:val="TableauNormal"/>
     <w:uiPriority w:val="70"/>
     <w:rsid w:val="00CB0664"/>
     <w:pPr>
@@ -15154,9 +15561,9 @@
       </w:tcPr>
     </w:tblStylePr>
   </w:style>
-  <w:style w:type="table" w:styleId="DarkList-Accent6">
+  <w:style w:type="table" w:styleId="Listefonce-Accent6">
     <w:name w:val="Dark List Accent 6"/>
-    <w:basedOn w:val="TableNormal"/>
+    <w:basedOn w:val="TableauNormal"/>
     <w:uiPriority w:val="70"/>
     <w:rsid w:val="00CB0664"/>
     <w:pPr>
@@ -15261,9 +15668,9 @@
       </w:tcPr>
     </w:tblStylePr>
   </w:style>
-  <w:style w:type="table" w:styleId="ColorfulShading">
+  <w:style w:type="table" w:styleId="Tramecouleur">
     <w:name w:val="Colorful Shading"/>
-    <w:basedOn w:val="TableNormal"/>
+    <w:basedOn w:val="TableauNormal"/>
     <w:uiPriority w:val="71"/>
     <w:rsid w:val="00CB0664"/>
     <w:pPr>
@@ -15376,9 +15783,9 @@
       </w:rPr>
     </w:tblStylePr>
   </w:style>
-  <w:style w:type="table" w:styleId="ColorfulShading-Accent1">
+  <w:style w:type="table" w:styleId="Tramecouleur-Accent1">
     <w:name w:val="Colorful Shading Accent 1"/>
-    <w:basedOn w:val="TableNormal"/>
+    <w:basedOn w:val="TableauNormal"/>
     <w:uiPriority w:val="71"/>
     <w:rsid w:val="00CB0664"/>
     <w:pPr>
@@ -15491,9 +15898,9 @@
       </w:rPr>
     </w:tblStylePr>
   </w:style>
-  <w:style w:type="table" w:styleId="ColorfulShading-Accent2">
+  <w:style w:type="table" w:styleId="Tramecouleur-Accent2">
     <w:name w:val="Colorful Shading Accent 2"/>
-    <w:basedOn w:val="TableNormal"/>
+    <w:basedOn w:val="TableauNormal"/>
     <w:uiPriority w:val="71"/>
     <w:rsid w:val="00CB0664"/>
     <w:pPr>
@@ -15606,9 +16013,9 @@
       </w:rPr>
     </w:tblStylePr>
   </w:style>
-  <w:style w:type="table" w:styleId="ColorfulShading-Accent3">
+  <w:style w:type="table" w:styleId="Tramecouleur-Accent3">
     <w:name w:val="Colorful Shading Accent 3"/>
-    <w:basedOn w:val="TableNormal"/>
+    <w:basedOn w:val="TableauNormal"/>
     <w:uiPriority w:val="71"/>
     <w:rsid w:val="00CB0664"/>
     <w:pPr>
@@ -15711,9 +16118,9 @@
       </w:tcPr>
     </w:tblStylePr>
   </w:style>
-  <w:style w:type="table" w:styleId="ColorfulShading-Accent4">
+  <w:style w:type="table" w:styleId="Tramecouleur-Accent4">
     <w:name w:val="Colorful Shading Accent 4"/>
-    <w:basedOn w:val="TableNormal"/>
+    <w:basedOn w:val="TableauNormal"/>
     <w:uiPriority w:val="71"/>
     <w:rsid w:val="00CB0664"/>
     <w:pPr>
@@ -15826,9 +16233,9 @@
       </w:rPr>
     </w:tblStylePr>
   </w:style>
-  <w:style w:type="table" w:styleId="ColorfulShading-Accent5">
+  <w:style w:type="table" w:styleId="Tramecouleur-Accent5">
     <w:name w:val="Colorful Shading Accent 5"/>
-    <w:basedOn w:val="TableNormal"/>
+    <w:basedOn w:val="TableauNormal"/>
     <w:uiPriority w:val="71"/>
     <w:rsid w:val="00CB0664"/>
     <w:pPr>
@@ -15941,9 +16348,9 @@
       </w:rPr>
     </w:tblStylePr>
   </w:style>
-  <w:style w:type="table" w:styleId="ColorfulShading-Accent6">
+  <w:style w:type="table" w:styleId="Tramecouleur-Accent6">
     <w:name w:val="Colorful Shading Accent 6"/>
-    <w:basedOn w:val="TableNormal"/>
+    <w:basedOn w:val="TableauNormal"/>
     <w:uiPriority w:val="71"/>
     <w:rsid w:val="00CB0664"/>
     <w:pPr>
@@ -16056,9 +16463,9 @@
       </w:rPr>
     </w:tblStylePr>
   </w:style>
-  <w:style w:type="table" w:styleId="ColorfulList">
+  <w:style w:type="table" w:styleId="Listecouleur">
     <w:name w:val="Colorful List"/>
-    <w:basedOn w:val="TableNormal"/>
+    <w:basedOn w:val="TableauNormal"/>
     <w:uiPriority w:val="72"/>
     <w:rsid w:val="00CB0664"/>
     <w:pPr>
@@ -16135,9 +16542,9 @@
       </w:tcPr>
     </w:tblStylePr>
   </w:style>
-  <w:style w:type="table" w:styleId="ColorfulList-Accent1">
+  <w:style w:type="table" w:styleId="Listecouleur-Accent1">
     <w:name w:val="Colorful List Accent 1"/>
-    <w:basedOn w:val="TableNormal"/>
+    <w:basedOn w:val="TableauNormal"/>
     <w:uiPriority w:val="72"/>
     <w:rsid w:val="00CB0664"/>
     <w:pPr>
@@ -16214,9 +16621,9 @@
       </w:tcPr>
     </w:tblStylePr>
   </w:style>
-  <w:style w:type="table" w:styleId="ColorfulList-Accent2">
+  <w:style w:type="table" w:styleId="Listecouleur-Accent2">
     <w:name w:val="Colorful List Accent 2"/>
-    <w:basedOn w:val="TableNormal"/>
+    <w:basedOn w:val="TableauNormal"/>
     <w:uiPriority w:val="72"/>
     <w:rsid w:val="00CB0664"/>
     <w:pPr>
@@ -16293,9 +16700,9 @@
       </w:tcPr>
     </w:tblStylePr>
   </w:style>
-  <w:style w:type="table" w:styleId="ColorfulList-Accent3">
+  <w:style w:type="table" w:styleId="Listecouleur-Accent3">
     <w:name w:val="Colorful List Accent 3"/>
-    <w:basedOn w:val="TableNormal"/>
+    <w:basedOn w:val="TableauNormal"/>
     <w:uiPriority w:val="72"/>
     <w:rsid w:val="00CB0664"/>
     <w:pPr>
@@ -16372,9 +16779,9 @@
       </w:tcPr>
     </w:tblStylePr>
   </w:style>
-  <w:style w:type="table" w:styleId="ColorfulList-Accent4">
+  <w:style w:type="table" w:styleId="Listecouleur-Accent4">
     <w:name w:val="Colorful List Accent 4"/>
-    <w:basedOn w:val="TableNormal"/>
+    <w:basedOn w:val="TableauNormal"/>
     <w:uiPriority w:val="72"/>
     <w:rsid w:val="00CB0664"/>
     <w:pPr>
@@ -16451,9 +16858,9 @@
       </w:tcPr>
     </w:tblStylePr>
   </w:style>
-  <w:style w:type="table" w:styleId="ColorfulList-Accent5">
+  <w:style w:type="table" w:styleId="Listecouleur-Accent5">
     <w:name w:val="Colorful List Accent 5"/>
-    <w:basedOn w:val="TableNormal"/>
+    <w:basedOn w:val="TableauNormal"/>
     <w:uiPriority w:val="72"/>
     <w:rsid w:val="00CB0664"/>
     <w:pPr>
@@ -16530,9 +16937,9 @@
       </w:tcPr>
     </w:tblStylePr>
   </w:style>
-  <w:style w:type="table" w:styleId="ColorfulList-Accent6">
+  <w:style w:type="table" w:styleId="Listecouleur-Accent6">
     <w:name w:val="Colorful List Accent 6"/>
-    <w:basedOn w:val="TableNormal"/>
+    <w:basedOn w:val="TableauNormal"/>
     <w:uiPriority w:val="72"/>
     <w:rsid w:val="00CB0664"/>
     <w:pPr>
@@ -16609,9 +17016,9 @@
       </w:tcPr>
     </w:tblStylePr>
   </w:style>
-  <w:style w:type="table" w:styleId="ColorfulGrid">
+  <w:style w:type="table" w:styleId="Grillecouleur">
     <w:name w:val="Colorful Grid"/>
-    <w:basedOn w:val="TableNormal"/>
+    <w:basedOn w:val="TableauNormal"/>
     <w:uiPriority w:val="73"/>
     <w:rsid w:val="00CB0664"/>
     <w:pPr>
@@ -16682,9 +17089,9 @@
       </w:tcPr>
     </w:tblStylePr>
   </w:style>
-  <w:style w:type="table" w:styleId="ColorfulGrid-Accent1">
+  <w:style w:type="table" w:styleId="Grillecouleur-Accent1">
     <w:name w:val="Colorful Grid Accent 1"/>
-    <w:basedOn w:val="TableNormal"/>
+    <w:basedOn w:val="TableauNormal"/>
     <w:uiPriority w:val="73"/>
     <w:rsid w:val="00CB0664"/>
     <w:pPr>
@@ -16755,9 +17162,9 @@
       </w:tcPr>
     </w:tblStylePr>
   </w:style>
-  <w:style w:type="table" w:styleId="ColorfulGrid-Accent2">
+  <w:style w:type="table" w:styleId="Grillecouleur-Accent2">
     <w:name w:val="Colorful Grid Accent 2"/>
-    <w:basedOn w:val="TableNormal"/>
+    <w:basedOn w:val="TableauNormal"/>
     <w:uiPriority w:val="73"/>
     <w:rsid w:val="00CB0664"/>
     <w:pPr>
@@ -16828,9 +17235,9 @@
       </w:tcPr>
     </w:tblStylePr>
   </w:style>
-  <w:style w:type="table" w:styleId="ColorfulGrid-Accent3">
+  <w:style w:type="table" w:styleId="Grillecouleur-Accent3">
     <w:name w:val="Colorful Grid Accent 3"/>
-    <w:basedOn w:val="TableNormal"/>
+    <w:basedOn w:val="TableauNormal"/>
     <w:uiPriority w:val="73"/>
     <w:rsid w:val="00CB0664"/>
     <w:pPr>
@@ -16901,9 +17308,9 @@
       </w:tcPr>
     </w:tblStylePr>
   </w:style>
-  <w:style w:type="table" w:styleId="ColorfulGrid-Accent4">
+  <w:style w:type="table" w:styleId="Grillecouleur-Accent4">
     <w:name w:val="Colorful Grid Accent 4"/>
-    <w:basedOn w:val="TableNormal"/>
+    <w:basedOn w:val="TableauNormal"/>
     <w:uiPriority w:val="73"/>
     <w:rsid w:val="00CB0664"/>
     <w:pPr>
@@ -16974,9 +17381,9 @@
       </w:tcPr>
     </w:tblStylePr>
   </w:style>
-  <w:style w:type="table" w:styleId="ColorfulGrid-Accent5">
+  <w:style w:type="table" w:styleId="Grillecouleur-Accent5">
     <w:name w:val="Colorful Grid Accent 5"/>
-    <w:basedOn w:val="TableNormal"/>
+    <w:basedOn w:val="TableauNormal"/>
     <w:uiPriority w:val="73"/>
     <w:rsid w:val="00CB0664"/>
     <w:pPr>
@@ -17047,9 +17454,9 @@
       </w:tcPr>
     </w:tblStylePr>
   </w:style>
-  <w:style w:type="table" w:styleId="ColorfulGrid-Accent6">
+  <w:style w:type="table" w:styleId="Grillecouleur-Accent6">
     <w:name w:val="Colorful Grid Accent 6"/>
-    <w:basedOn w:val="TableNormal"/>
+    <w:basedOn w:val="TableauNormal"/>
     <w:uiPriority w:val="73"/>
     <w:rsid w:val="00CB0664"/>
     <w:pPr>
@@ -17448,7 +17855,7 @@
 </file>
 
 <file path=customXml/itemProps1.xml><?xml version="1.0" encoding="utf-8"?>
-<ds:datastoreItem xmlns:ds="http://schemas.openxmlformats.org/officeDocument/2006/customXml" ds:itemID="{EF278816-EC6F-A645-907D-7F25AECB1D4A}">
+<ds:datastoreItem xmlns:ds="http://schemas.openxmlformats.org/officeDocument/2006/customXml" ds:itemID="{96F52896-01CF-4B5F-A67B-D6B8389E3D07}">
   <ds:schemaRefs>
     <ds:schemaRef ds:uri="http://schemas.openxmlformats.org/officeDocument/2006/bibliography"/>
   </ds:schemaRefs>

</xml_diff>